<commit_message>
Mettre à jour l'intitulé du profil (Architecte Logiciel .NET)
Aligner le hero, les métadonnées og/twitter et le CV sur le nouveau
positionnement : architecture .NET, modernisation ERP, IA générative.

Co-Authored-By: Claude Sonnet 5 <noreply@anthropic.com>
</commit_message>
<xml_diff>
--- a/doc/CV_Raphael_Scapolan.docx
+++ b/doc/CV_Raphael_Scapolan.docx
@@ -144,21 +144,70 @@
             <w:pPr>
               <w:spacing w:before="80" w:after="0"/>
               <w:rPr>
+                <w:sz w:val="21"/>
+                <w:szCs w:val="21"/>
                 <w:lang w:val="fr-FR"/>
               </w:rPr>
             </w:pPr>
             <w:r>
               <w:rPr>
                 <w:color w:val="FFFFFF"/>
-                <w:sz w:val="23"/>
-                <w:lang w:val="fr-FR"/>
-              </w:rPr>
-              <w:t>Développeur Senior .NET / WPF</w:t>
+                <w:sz w:val="21"/>
+                <w:szCs w:val="21"/>
+                <w:lang w:val="fr-FR"/>
+              </w:rPr>
+              <w:t xml:space="preserve">Architecte Logiciel .NET </w:t>
             </w:r>
             <w:r>
               <w:rPr>
                 <w:color w:val="FFFFFF"/>
-                <w:sz w:val="23"/>
+                <w:sz w:val="21"/>
+                <w:szCs w:val="21"/>
+                <w:lang w:val="fr-FR"/>
+              </w:rPr>
+              <w:t>·</w:t>
+            </w:r>
+            <w:r>
+              <w:rPr>
+                <w:color w:val="FFFFFF"/>
+                <w:sz w:val="21"/>
+                <w:szCs w:val="21"/>
+                <w:lang w:val="fr-FR"/>
+              </w:rPr>
+              <w:t xml:space="preserve"> Modernisation ERP &amp; Applications Métier </w:t>
+            </w:r>
+            <w:r>
+              <w:rPr>
+                <w:color w:val="FFFFFF"/>
+                <w:sz w:val="21"/>
+                <w:szCs w:val="21"/>
+                <w:lang w:val="fr-FR"/>
+              </w:rPr>
+              <w:t>·</w:t>
+            </w:r>
+            <w:r>
+              <w:rPr>
+                <w:color w:val="FFFFFF"/>
+                <w:sz w:val="21"/>
+                <w:szCs w:val="21"/>
+                <w:lang w:val="fr-FR"/>
+              </w:rPr>
+              <w:t xml:space="preserve"> IA Générative </w:t>
+            </w:r>
+            <w:r>
+              <w:rPr>
+                <w:color w:val="FFFFFF"/>
+                <w:sz w:val="21"/>
+                <w:szCs w:val="21"/>
+                <w:lang w:val="fr-FR"/>
+              </w:rPr>
+              <w:t>·</w:t>
+            </w:r>
+            <w:r>
+              <w:rPr>
+                <w:color w:val="FFFFFF"/>
+                <w:sz w:val="21"/>
+                <w:szCs w:val="21"/>
                 <w:lang w:val="fr-FR"/>
               </w:rPr>
               <w:t xml:space="preserve"> </w:t>
@@ -166,10 +215,11 @@
             <w:r>
               <w:rPr>
                 <w:color w:val="FFFFFF"/>
-                <w:sz w:val="23"/>
-                <w:lang w:val="fr-FR"/>
-              </w:rPr>
-              <w:t>· Architecte logiciel · PhD</w:t>
+                <w:sz w:val="21"/>
+                <w:szCs w:val="21"/>
+                <w:lang w:val="fr-FR"/>
+              </w:rPr>
+              <w:t>PhD</w:t>
             </w:r>
           </w:p>
         </w:tc>
@@ -220,6 +270,7 @@
                 <w:caps/>
                 <w:color w:val="2C4C68"/>
                 <w:sz w:val="24"/>
+                <w:lang w:val="fr-FR"/>
               </w:rPr>
               <w:t>é</w:t>
             </w:r>
@@ -338,12 +389,21 @@
                 <w:lang w:val="fi-FI"/>
               </w:rPr>
             </w:pPr>
+            <w:proofErr w:type="gramStart"/>
             <w:r>
               <w:rPr>
                 <w:b/>
                 <w:lang w:val="fi-FI"/>
               </w:rPr>
-              <w:t xml:space="preserve">Portfolio : </w:t>
+              <w:t>Portfolio :</w:t>
+            </w:r>
+            <w:proofErr w:type="gramEnd"/>
+            <w:r>
+              <w:rPr>
+                <w:b/>
+                <w:lang w:val="fi-FI"/>
+              </w:rPr>
+              <w:t xml:space="preserve"> </w:t>
             </w:r>
             <w:hyperlink r:id="rId11" w:history="1">
               <w:r>
@@ -387,7 +447,14 @@
               <w:rPr>
                 <w:b/>
               </w:rPr>
-              <w:t>/ WPF</w:t>
+              <w:t xml:space="preserve">/ </w:t>
+            </w:r>
+            <w:proofErr w:type="gramStart"/>
+            <w:r>
+              <w:rPr>
+                <w:b/>
+              </w:rPr>
+              <w:t>WPF</w:t>
             </w:r>
             <w:r>
               <w:rPr>
@@ -396,11 +463,13 @@
               </w:rPr>
               <w:t xml:space="preserve">  expert</w:t>
             </w:r>
+            <w:proofErr w:type="gramEnd"/>
           </w:p>
           <w:p>
             <w:pPr>
               <w:pStyle w:val="ListBullet"/>
             </w:pPr>
+            <w:proofErr w:type="gramStart"/>
             <w:r>
               <w:rPr>
                 <w:b/>
@@ -412,8 +481,18 @@
                 <w:i/>
                 <w:sz w:val="17"/>
               </w:rPr>
-              <w:t xml:space="preserve">  confirmé</w:t>
-            </w:r>
+              <w:t xml:space="preserve">  </w:t>
+            </w:r>
+            <w:proofErr w:type="spellStart"/>
+            <w:r>
+              <w:rPr>
+                <w:i/>
+                <w:sz w:val="17"/>
+              </w:rPr>
+              <w:t>confirmé</w:t>
+            </w:r>
+            <w:proofErr w:type="spellEnd"/>
+            <w:proofErr w:type="gramEnd"/>
           </w:p>
           <w:p>
             <w:pPr>
@@ -435,8 +514,21 @@
             <w:pPr>
               <w:pStyle w:val="ListBullet"/>
             </w:pPr>
-            <w:r>
-              <w:t>Specflow / Reqnroll (BDD)</w:t>
+            <w:proofErr w:type="spellStart"/>
+            <w:r>
+              <w:t>Specflow</w:t>
+            </w:r>
+            <w:proofErr w:type="spellEnd"/>
+            <w:r>
+              <w:t xml:space="preserve"> / </w:t>
+            </w:r>
+            <w:proofErr w:type="spellStart"/>
+            <w:r>
+              <w:t>Reqnroll</w:t>
+            </w:r>
+            <w:proofErr w:type="spellEnd"/>
+            <w:r>
+              <w:t xml:space="preserve"> (BDD)</w:t>
             </w:r>
           </w:p>
           <w:p>
@@ -444,23 +536,41 @@
               <w:pStyle w:val="ListBullet"/>
             </w:pPr>
             <w:r>
-              <w:t>Architecture logicielle</w:t>
-            </w:r>
+              <w:t xml:space="preserve">Architecture </w:t>
+            </w:r>
+            <w:proofErr w:type="spellStart"/>
+            <w:r>
+              <w:t>logicielle</w:t>
+            </w:r>
+            <w:proofErr w:type="spellEnd"/>
           </w:p>
           <w:p>
             <w:pPr>
               <w:pStyle w:val="ListBullet"/>
             </w:pPr>
             <w:r>
-              <w:t>Migration d'applications legacy</w:t>
+              <w:t xml:space="preserve">Migration </w:t>
+            </w:r>
+            <w:proofErr w:type="spellStart"/>
+            <w:r>
+              <w:t>d'applications</w:t>
+            </w:r>
+            <w:proofErr w:type="spellEnd"/>
+            <w:r>
+              <w:t xml:space="preserve"> legacy</w:t>
             </w:r>
           </w:p>
           <w:p>
             <w:pPr>
               <w:pStyle w:val="ListBullet"/>
             </w:pPr>
-            <w:r>
-              <w:t>Méthode Agile</w:t>
+            <w:proofErr w:type="spellStart"/>
+            <w:r>
+              <w:t>Méthode</w:t>
+            </w:r>
+            <w:proofErr w:type="spellEnd"/>
+            <w:r>
+              <w:t xml:space="preserve"> Agile</w:t>
             </w:r>
           </w:p>
           <w:p>
@@ -492,8 +602,13 @@
             <w:pPr>
               <w:pStyle w:val="ListBullet"/>
             </w:pPr>
-            <w:r>
-              <w:t>Automatisation de processus métier</w:t>
+            <w:proofErr w:type="spellStart"/>
+            <w:r>
+              <w:t>Automatisation</w:t>
+            </w:r>
+            <w:proofErr w:type="spellEnd"/>
+            <w:r>
+              <w:t xml:space="preserve"> de processus métier</w:t>
             </w:r>
           </w:p>
           <w:p>
@@ -791,16 +906,31 @@
               <w:pStyle w:val="ListBullet"/>
             </w:pPr>
             <w:r>
-              <w:t>Français — langue maternelle</w:t>
-            </w:r>
+              <w:t xml:space="preserve">Français — langue </w:t>
+            </w:r>
+            <w:proofErr w:type="spellStart"/>
+            <w:r>
+              <w:t>maternelle</w:t>
+            </w:r>
+            <w:proofErr w:type="spellEnd"/>
           </w:p>
           <w:p>
             <w:pPr>
               <w:pStyle w:val="ListBullet"/>
             </w:pPr>
-            <w:r>
-              <w:t>Anglais — professionnel</w:t>
-            </w:r>
+            <w:proofErr w:type="spellStart"/>
+            <w:r>
+              <w:t>Anglais</w:t>
+            </w:r>
+            <w:proofErr w:type="spellEnd"/>
+            <w:r>
+              <w:t xml:space="preserve"> — </w:t>
+            </w:r>
+            <w:proofErr w:type="spellStart"/>
+            <w:r>
+              <w:t>professionnel</w:t>
+            </w:r>
+            <w:proofErr w:type="spellEnd"/>
           </w:p>
           <w:p>
             <w:pPr>
@@ -873,9 +1003,11 @@
                 <w:lang w:val="fr-FR"/>
               </w:rPr>
             </w:pPr>
+            <w:proofErr w:type="spellStart"/>
             <w:r>
               <w:t>Bénévolat</w:t>
             </w:r>
+            <w:proofErr w:type="spellEnd"/>
           </w:p>
         </w:tc>
         <w:tc>
@@ -1243,18 +1375,41 @@
                 <w:lang w:val="fr-FR"/>
               </w:rPr>
             </w:pPr>
+            <w:proofErr w:type="spellStart"/>
             <w:r>
               <w:rPr>
                 <w:b/>
                 <w:lang w:val="fr-FR"/>
               </w:rPr>
-              <w:t xml:space="preserve">Core ERP &amp; e-commerce — </w:t>
-            </w:r>
-            <w:r>
-              <w:rPr>
-                <w:lang w:val="fr-FR"/>
-              </w:rPr>
-              <w:t>développement du module d'achats intégré et de l'interconnexion e-commerce par flux cXML.</w:t>
+              <w:t>Core</w:t>
+            </w:r>
+            <w:proofErr w:type="spellEnd"/>
+            <w:r>
+              <w:rPr>
+                <w:b/>
+                <w:lang w:val="fr-FR"/>
+              </w:rPr>
+              <w:t xml:space="preserve"> ERP &amp; e-commerce — </w:t>
+            </w:r>
+            <w:r>
+              <w:rPr>
+                <w:lang w:val="fr-FR"/>
+              </w:rPr>
+              <w:t xml:space="preserve">développement du module d'achats intégré et de l'interconnexion e-commerce par flux </w:t>
+            </w:r>
+            <w:proofErr w:type="spellStart"/>
+            <w:r>
+              <w:rPr>
+                <w:lang w:val="fr-FR"/>
+              </w:rPr>
+              <w:t>cXML</w:t>
+            </w:r>
+            <w:proofErr w:type="spellEnd"/>
+            <w:r>
+              <w:rPr>
+                <w:lang w:val="fr-FR"/>
+              </w:rPr>
+              <w:t>.</w:t>
             </w:r>
           </w:p>
           <w:p>
@@ -1275,7 +1430,21 @@
               <w:rPr>
                 <w:lang w:val="fr-FR"/>
               </w:rPr>
-              <w:t xml:space="preserve">client lourd adossé à un serveur, chaîne CI/CD GitLab, outillage interne de pilotage local </w:t>
+              <w:t xml:space="preserve">client lourd adossé à un serveur, chaîne CI/CD </w:t>
+            </w:r>
+            <w:proofErr w:type="spellStart"/>
+            <w:r>
+              <w:rPr>
+                <w:lang w:val="fr-FR"/>
+              </w:rPr>
+              <w:t>GitLab</w:t>
+            </w:r>
+            <w:proofErr w:type="spellEnd"/>
+            <w:r>
+              <w:rPr>
+                <w:lang w:val="fr-FR"/>
+              </w:rPr>
+              <w:t xml:space="preserve">, outillage interne de pilotage local </w:t>
             </w:r>
             <w:r>
               <w:rPr>
@@ -1320,7 +1489,35 @@
               <w:rPr>
                 <w:lang w:val="fr-FR"/>
               </w:rPr>
-              <w:t>tests automatisés BDD (Specflow / Reqnroll), indexation des règles métier, revue de code systématique.</w:t>
+              <w:t>tests automatisés BDD (</w:t>
+            </w:r>
+            <w:proofErr w:type="spellStart"/>
+            <w:r>
+              <w:rPr>
+                <w:lang w:val="fr-FR"/>
+              </w:rPr>
+              <w:t>Specflow</w:t>
+            </w:r>
+            <w:proofErr w:type="spellEnd"/>
+            <w:r>
+              <w:rPr>
+                <w:lang w:val="fr-FR"/>
+              </w:rPr>
+              <w:t xml:space="preserve"> / </w:t>
+            </w:r>
+            <w:proofErr w:type="spellStart"/>
+            <w:r>
+              <w:rPr>
+                <w:lang w:val="fr-FR"/>
+              </w:rPr>
+              <w:t>Reqnroll</w:t>
+            </w:r>
+            <w:proofErr w:type="spellEnd"/>
+            <w:r>
+              <w:rPr>
+                <w:lang w:val="fr-FR"/>
+              </w:rPr>
+              <w:t>), indexation des règles métier, revue de code systématique.</w:t>
             </w:r>
           </w:p>
           <w:p>
@@ -1341,7 +1538,21 @@
               <w:rPr>
                 <w:lang w:val="fr-FR"/>
               </w:rPr>
-              <w:t>automatisation des demandes d'achat et du traitement des factures, extraction intelligente, matching.</w:t>
+              <w:t xml:space="preserve">automatisation des demandes d'achat et du traitement des factures, extraction intelligente, </w:t>
+            </w:r>
+            <w:proofErr w:type="spellStart"/>
+            <w:r>
+              <w:rPr>
+                <w:lang w:val="fr-FR"/>
+              </w:rPr>
+              <w:t>matching</w:t>
+            </w:r>
+            <w:proofErr w:type="spellEnd"/>
+            <w:r>
+              <w:rPr>
+                <w:lang w:val="fr-FR"/>
+              </w:rPr>
+              <w:t>.</w:t>
             </w:r>
           </w:p>
           <w:p>
@@ -1362,7 +1573,49 @@
               <w:rPr>
                 <w:lang w:val="fr-FR"/>
               </w:rPr>
-              <w:t>développement assisté par IA, revue de code augmentée, écosystème de MCPs (indexation de codebase, GitLab / Redmine), AI Buildathons.</w:t>
+              <w:t xml:space="preserve">développement assisté par IA, revue de code augmentée, écosystème de </w:t>
+            </w:r>
+            <w:proofErr w:type="spellStart"/>
+            <w:r>
+              <w:rPr>
+                <w:lang w:val="fr-FR"/>
+              </w:rPr>
+              <w:t>MCPs</w:t>
+            </w:r>
+            <w:proofErr w:type="spellEnd"/>
+            <w:r>
+              <w:rPr>
+                <w:lang w:val="fr-FR"/>
+              </w:rPr>
+              <w:t xml:space="preserve"> (indexation de codebase, </w:t>
+            </w:r>
+            <w:proofErr w:type="spellStart"/>
+            <w:r>
+              <w:rPr>
+                <w:lang w:val="fr-FR"/>
+              </w:rPr>
+              <w:t>GitLab</w:t>
+            </w:r>
+            <w:proofErr w:type="spellEnd"/>
+            <w:r>
+              <w:rPr>
+                <w:lang w:val="fr-FR"/>
+              </w:rPr>
+              <w:t xml:space="preserve"> / Redmine), AI </w:t>
+            </w:r>
+            <w:proofErr w:type="spellStart"/>
+            <w:r>
+              <w:rPr>
+                <w:lang w:val="fr-FR"/>
+              </w:rPr>
+              <w:t>Buildathons</w:t>
+            </w:r>
+            <w:proofErr w:type="spellEnd"/>
+            <w:r>
+              <w:rPr>
+                <w:lang w:val="fr-FR"/>
+              </w:rPr>
+              <w:t>.</w:t>
             </w:r>
           </w:p>
           <w:p>
@@ -1478,13 +1731,23 @@
                 <w:lang w:val="fr-FR"/>
               </w:rPr>
             </w:pPr>
+            <w:proofErr w:type="spellStart"/>
             <w:r>
               <w:rPr>
                 <w:b/>
                 <w:sz w:val="19"/>
                 <w:lang w:val="fr-FR"/>
               </w:rPr>
-              <w:t>Akkodis (ex-Akka Technologies) – mission Schneider Electric, Grenoble</w:t>
+              <w:t>Akkodis</w:t>
+            </w:r>
+            <w:proofErr w:type="spellEnd"/>
+            <w:r>
+              <w:rPr>
+                <w:b/>
+                <w:sz w:val="19"/>
+                <w:lang w:val="fr-FR"/>
+              </w:rPr>
+              <w:t xml:space="preserve"> (ex-Akka Technologies) – mission Schneider Electric, Grenoble</w:t>
             </w:r>
           </w:p>
           <w:p>
@@ -1607,13 +1870,23 @@
                 <w:lang w:val="fr-FR"/>
               </w:rPr>
             </w:pPr>
+            <w:proofErr w:type="spellStart"/>
             <w:r>
               <w:rPr>
                 <w:b/>
                 <w:sz w:val="19"/>
                 <w:lang w:val="fr-FR"/>
               </w:rPr>
-              <w:t>SIMaP, Laboratoire de Recherche sur les Matériaux – Grenoble</w:t>
+              <w:t>SIMaP</w:t>
+            </w:r>
+            <w:proofErr w:type="spellEnd"/>
+            <w:r>
+              <w:rPr>
+                <w:b/>
+                <w:sz w:val="19"/>
+                <w:lang w:val="fr-FR"/>
+              </w:rPr>
+              <w:t>, Laboratoire de Recherche sur les Matériaux – Grenoble</w:t>
             </w:r>
           </w:p>
           <w:p>
@@ -1640,18 +1913,41 @@
                 <w:lang w:val="fr-FR"/>
               </w:rPr>
             </w:pPr>
+            <w:proofErr w:type="spellStart"/>
             <w:r>
               <w:rPr>
                 <w:b/>
                 <w:lang w:val="fr-FR"/>
               </w:rPr>
-              <w:t xml:space="preserve">ModeLitz — </w:t>
-            </w:r>
-            <w:r>
-              <w:rPr>
-                <w:lang w:val="fr-FR"/>
-              </w:rPr>
-              <w:t>conception et implémentation d'un solveur HPC parallèle par méthode intégrale, déposé auprès de l'Agence pour la protection des programmes (IDDN.FR.001.120006.000.S).</w:t>
+              <w:t>ModeLitz</w:t>
+            </w:r>
+            <w:proofErr w:type="spellEnd"/>
+            <w:r>
+              <w:rPr>
+                <w:b/>
+                <w:lang w:val="fr-FR"/>
+              </w:rPr>
+              <w:t xml:space="preserve"> — </w:t>
+            </w:r>
+            <w:r>
+              <w:rPr>
+                <w:lang w:val="fr-FR"/>
+              </w:rPr>
+              <w:t>conception et implémentation d'un solveur HPC parallèle par méthode intégrale, déposé auprès de l'Agence pour la protection des programmes (IDDN.FR.001.</w:t>
+            </w:r>
+            <w:proofErr w:type="gramStart"/>
+            <w:r>
+              <w:rPr>
+                <w:lang w:val="fr-FR"/>
+              </w:rPr>
+              <w:t>120006.000.S</w:t>
+            </w:r>
+            <w:proofErr w:type="gramEnd"/>
+            <w:r>
+              <w:rPr>
+                <w:lang w:val="fr-FR"/>
+              </w:rPr>
+              <w:t>).</w:t>
             </w:r>
           </w:p>
           <w:p>
@@ -2002,12 +2298,23 @@
               <w:t xml:space="preserve">Thèse en texte intégral sur HAL : </w:t>
             </w:r>
             <w:hyperlink r:id="rId12" w:history="1">
+              <w:proofErr w:type="spellStart"/>
+              <w:proofErr w:type="gramStart"/>
               <w:r>
                 <w:rPr>
                   <w:rStyle w:val="Hyperlink"/>
                   <w:lang w:val="fr-FR"/>
                 </w:rPr>
-                <w:t>theses.hal.science/tel-01104637v1</w:t>
+                <w:t>theses.hal.science</w:t>
+              </w:r>
+              <w:proofErr w:type="spellEnd"/>
+              <w:proofErr w:type="gramEnd"/>
+              <w:r>
+                <w:rPr>
+                  <w:rStyle w:val="Hyperlink"/>
+                  <w:lang w:val="fr-FR"/>
+                </w:rPr>
+                <w:t>/tel-01104637v1</w:t>
               </w:r>
             </w:hyperlink>
             <w:r>
@@ -2032,7 +2339,15 @@
               <w:t>IEEE Transactions on Magnetics</w:t>
             </w:r>
             <w:r>
-              <w:t>, 50(2), février 2014 (DOI 10.1109/TMAG.2013.2282502).</w:t>
+              <w:t xml:space="preserve">, 50(2), </w:t>
+            </w:r>
+            <w:proofErr w:type="spellStart"/>
+            <w:r>
+              <w:t>février</w:t>
+            </w:r>
+            <w:proofErr w:type="spellEnd"/>
+            <w:r>
+              <w:t xml:space="preserve"> 2014 (DOI 10.1109/TMAG.2013.2282502).</w:t>
             </w:r>
           </w:p>
           <w:p>
@@ -2040,7 +2355,15 @@
               <w:pStyle w:val="ListBullet"/>
             </w:pPr>
             <w:r>
-              <w:t xml:space="preserve">3D Integral Method for Electromagnetic Processes Modelling — colloque scientifique </w:t>
+              <w:t xml:space="preserve">3D Integral Method for Electromagnetic Processes Modelling — colloque </w:t>
+            </w:r>
+            <w:proofErr w:type="spellStart"/>
+            <w:r>
+              <w:t>scientifique</w:t>
+            </w:r>
+            <w:proofErr w:type="spellEnd"/>
+            <w:r>
+              <w:t xml:space="preserve"> </w:t>
             </w:r>
             <w:r>
               <w:rPr>
@@ -2057,7 +2380,15 @@
               <w:t>nternational Modelling for Electromagnetic Processing</w:t>
             </w:r>
             <w:r>
-              <w:t>, septembre 2014.</w:t>
+              <w:t xml:space="preserve">, </w:t>
+            </w:r>
+            <w:proofErr w:type="spellStart"/>
+            <w:r>
+              <w:t>septembre</w:t>
+            </w:r>
+            <w:proofErr w:type="spellEnd"/>
+            <w:r>
+              <w:t xml:space="preserve"> 2014.</w:t>
             </w:r>
           </w:p>
           <w:p>
@@ -2123,7 +2454,21 @@
               <w:rPr>
                 <w:lang w:val="fr-FR"/>
               </w:rPr>
-              <w:t xml:space="preserve">interface Razor partagée entre </w:t>
+              <w:t xml:space="preserve">interface </w:t>
+            </w:r>
+            <w:proofErr w:type="spellStart"/>
+            <w:r>
+              <w:rPr>
+                <w:lang w:val="fr-FR"/>
+              </w:rPr>
+              <w:t>Razor</w:t>
+            </w:r>
+            <w:proofErr w:type="spellEnd"/>
+            <w:r>
+              <w:rPr>
+                <w:lang w:val="fr-FR"/>
+              </w:rPr>
+              <w:t xml:space="preserve"> partagée entre </w:t>
             </w:r>
             <w:r>
               <w:rPr>
@@ -2171,7 +2516,35 @@
               <w:rPr>
                 <w:lang w:val="fr-FR"/>
               </w:rPr>
-              <w:t>(.NET 10, MAUI, Blazor Hybrid, PostgreSQL, Docker).</w:t>
+              <w:t xml:space="preserve">(.NET 10, MAUI, </w:t>
+            </w:r>
+            <w:proofErr w:type="spellStart"/>
+            <w:r>
+              <w:rPr>
+                <w:lang w:val="fr-FR"/>
+              </w:rPr>
+              <w:t>Blazor</w:t>
+            </w:r>
+            <w:proofErr w:type="spellEnd"/>
+            <w:r>
+              <w:rPr>
+                <w:lang w:val="fr-FR"/>
+              </w:rPr>
+              <w:t xml:space="preserve"> </w:t>
+            </w:r>
+            <w:proofErr w:type="spellStart"/>
+            <w:r>
+              <w:rPr>
+                <w:lang w:val="fr-FR"/>
+              </w:rPr>
+              <w:t>Hybrid</w:t>
+            </w:r>
+            <w:proofErr w:type="spellEnd"/>
+            <w:r>
+              <w:rPr>
+                <w:lang w:val="fr-FR"/>
+              </w:rPr>
+              <w:t>, PostgreSQL, Docker).</w:t>
             </w:r>
           </w:p>
           <w:p>
@@ -2206,7 +2579,35 @@
               <w:rPr>
                 <w:lang w:val="fr-FR"/>
               </w:rPr>
-              <w:t>physique de vol, génération procédurale déterministe, suite de tests en headless (Godot 4, GDScript).</w:t>
+              <w:t xml:space="preserve">physique de vol, génération procédurale déterministe, suite de tests en </w:t>
+            </w:r>
+            <w:proofErr w:type="spellStart"/>
+            <w:r>
+              <w:rPr>
+                <w:lang w:val="fr-FR"/>
+              </w:rPr>
+              <w:t>headless</w:t>
+            </w:r>
+            <w:proofErr w:type="spellEnd"/>
+            <w:r>
+              <w:rPr>
+                <w:lang w:val="fr-FR"/>
+              </w:rPr>
+              <w:t xml:space="preserve"> (Godot 4, </w:t>
+            </w:r>
+            <w:proofErr w:type="spellStart"/>
+            <w:r>
+              <w:rPr>
+                <w:lang w:val="fr-FR"/>
+              </w:rPr>
+              <w:t>GDScript</w:t>
+            </w:r>
+            <w:proofErr w:type="spellEnd"/>
+            <w:r>
+              <w:rPr>
+                <w:lang w:val="fr-FR"/>
+              </w:rPr>
+              <w:t>).</w:t>
             </w:r>
           </w:p>
         </w:tc>
@@ -3115,7 +3516,6 @@
   <w:style w:type="character" w:default="1" w:styleId="DefaultParagraphFont">
     <w:name w:val="Default Paragraph Font"/>
     <w:uiPriority w:val="1"/>
-    <w:semiHidden/>
     <w:unhideWhenUsed/>
   </w:style>
   <w:style w:type="table" w:default="1" w:styleId="TableNormal">

</xml_diff>

<commit_message>
CV: suppressions des stages d'études
</commit_message>
<xml_diff>
--- a/doc/CV_Raphael_Scapolan.docx
+++ b/doc/CV_Raphael_Scapolan.docx
@@ -1336,171 +1336,6 @@
           <w:p>
             <w:pPr>
               <w:keepNext/>
-              <w:spacing w:before="240" w:after="0"/>
-              <w:rPr>
-                <w:b/>
-                <w:color w:val="2C4C68"/>
-                <w:sz w:val="21"/>
-                <w:szCs w:val="21"/>
-              </w:rPr>
-            </w:pPr>
-            <w:r>
-              <w:rPr>
-                <w:b/>
-                <w:color w:val="2C4C68"/>
-                <w:sz w:val="21"/>
-                <w:szCs w:val="21"/>
-              </w:rPr>
-              <w:t>Stage de recherche</w:t>
-            </w:r>
-          </w:p>
-          <w:p>
-            <w:pPr>
-              <w:keepNext/>
-              <w:spacing w:after="0"/>
-              <w:rPr>
-                <w:sz w:val="21"/>
-                <w:szCs w:val="21"/>
-              </w:rPr>
-            </w:pPr>
-            <w:r>
-              <w:rPr>
-                <w:b/>
-                <w:sz w:val="21"/>
-                <w:szCs w:val="21"/>
-              </w:rPr>
-              <w:t>03/2010 – 08/2010</w:t>
-            </w:r>
-            <w:r>
-              <w:rPr>
-                <w:b/>
-                <w:sz w:val="21"/>
-                <w:szCs w:val="21"/>
-              </w:rPr>
-              <w:t xml:space="preserve"> </w:t>
-            </w:r>
-            <w:r>
-              <w:rPr>
-                <w:b/>
-                <w:i/>
-                <w:iCs/>
-                <w:sz w:val="21"/>
-                <w:szCs w:val="21"/>
-              </w:rPr>
-              <w:t>(6 mois)</w:t>
-            </w:r>
-          </w:p>
-          <w:p>
-            <w:pPr>
-              <w:keepNext/>
-              <w:spacing w:after="60"/>
-            </w:pPr>
-            <w:r>
-              <w:rPr>
-                <w:b/>
-                <w:sz w:val="19"/>
-              </w:rPr>
-              <w:t>CEA, Leti – Grenoble</w:t>
-            </w:r>
-          </w:p>
-          <w:p>
-            <w:pPr>
-              <w:pStyle w:val="Listepuces"/>
-            </w:pPr>
-            <w:r>
-              <w:t>Modélisation d'électrodes de stimulation rétinienne sous COMSOL, calculs pilotés par MATLAB.</w:t>
-            </w:r>
-          </w:p>
-          <w:p>
-            <w:pPr>
-              <w:pStyle w:val="Listepuces"/>
-            </w:pPr>
-            <w:r>
-              <w:lastRenderedPageBreak/>
-              <w:t>Mesures d'impédance et aide à la caractérisation des électrodes.</w:t>
-            </w:r>
-          </w:p>
-          <w:p>
-            <w:pPr>
-              <w:keepNext/>
-              <w:spacing w:before="240" w:after="0"/>
-              <w:rPr>
-                <w:b/>
-                <w:color w:val="2C4C68"/>
-                <w:sz w:val="21"/>
-                <w:szCs w:val="21"/>
-              </w:rPr>
-            </w:pPr>
-            <w:r>
-              <w:rPr>
-                <w:b/>
-                <w:color w:val="2C4C68"/>
-                <w:sz w:val="21"/>
-                <w:szCs w:val="21"/>
-              </w:rPr>
-              <w:t>Stage de recherche</w:t>
-            </w:r>
-          </w:p>
-          <w:p>
-            <w:pPr>
-              <w:keepNext/>
-              <w:spacing w:after="0"/>
-              <w:rPr>
-                <w:sz w:val="21"/>
-                <w:szCs w:val="21"/>
-              </w:rPr>
-            </w:pPr>
-            <w:r>
-              <w:rPr>
-                <w:b/>
-                <w:sz w:val="21"/>
-                <w:szCs w:val="21"/>
-              </w:rPr>
-              <w:t>05/2009 – 06/2009</w:t>
-            </w:r>
-            <w:r>
-              <w:rPr>
-                <w:b/>
-                <w:sz w:val="21"/>
-                <w:szCs w:val="21"/>
-              </w:rPr>
-              <w:t xml:space="preserve"> </w:t>
-            </w:r>
-            <w:r>
-              <w:rPr>
-                <w:b/>
-                <w:i/>
-                <w:iCs/>
-                <w:sz w:val="21"/>
-                <w:szCs w:val="21"/>
-              </w:rPr>
-              <w:t>(2 mois)</w:t>
-            </w:r>
-          </w:p>
-          <w:p>
-            <w:pPr>
-              <w:keepNext/>
-              <w:spacing w:after="60"/>
-            </w:pPr>
-            <w:r>
-              <w:rPr>
-                <w:b/>
-                <w:sz w:val="19"/>
-              </w:rPr>
-              <w:t>Laboratoire d'Annecy-le-Vieux de Physique Théorique (LAPTH) – Annecy</w:t>
-            </w:r>
-          </w:p>
-          <w:p>
-            <w:pPr>
-              <w:pStyle w:val="Listepuces"/>
-            </w:pPr>
-            <w:r>
-              <w:t>Calcul de la probabilité de désintégration du boson de Higgs, développement en C++.</w:t>
-            </w:r>
-          </w:p>
-          <w:p>
-            <w:pPr>
-              <w:keepNext/>
               <w:pBdr>
                 <w:bottom w:val="single" w:sz="6" w:space="3" w:color="2C4C68"/>
               </w:pBdr>
@@ -1555,14 +1390,22 @@
           <w:p>
             <w:pPr>
               <w:pStyle w:val="Listepuces"/>
+              <w:rPr>
+                <w:lang w:val="en-US"/>
+              </w:rPr>
             </w:pPr>
             <w:r>
+              <w:rPr>
+                <w:lang w:val="en-US"/>
+              </w:rPr>
+              <w:lastRenderedPageBreak/>
               <w:t xml:space="preserve">3D Integral Method for Electromagnetic Processes Modelling — colloque scientifique </w:t>
             </w:r>
             <w:r>
               <w:rPr>
                 <w:b/>
                 <w:bCs/>
+                <w:lang w:val="en-US"/>
               </w:rPr>
               <w:t>I</w:t>
             </w:r>
@@ -1570,10 +1413,14 @@
               <w:rPr>
                 <w:b/>
                 <w:bCs/>
+                <w:lang w:val="en-US"/>
               </w:rPr>
               <w:t>nternational Modelling for Electromagnetic Processing</w:t>
             </w:r>
             <w:r>
+              <w:rPr>
+                <w:lang w:val="en-US"/>
+              </w:rPr>
               <w:t>, septembre 2014.</w:t>
             </w:r>
           </w:p>
@@ -1779,34 +1626,36 @@
   <w:abstractNum w:abstractNumId="0" w15:restartNumberingAfterBreak="0">
     <w:nsid w:val="FFFFFF7C"/>
     <w:multiLevelType w:val="singleLevel"/>
-    <w:tmpl w:val="C310EC42"/>
+    <w:tmpl w:val="7D72F6B4"/>
     <w:lvl w:ilvl="0">
       <w:start w:val="1"/>
       <w:numFmt w:val="decimal"/>
+      <w:pStyle w:val="Listenumros5"/>
       <w:lvlText w:val="%1."/>
       <w:lvlJc w:val="left"/>
       <w:pPr>
         <w:tabs>
-          <w:tab w:val="num" w:pos="1800"/>
+          <w:tab w:val="num" w:pos="1492"/>
         </w:tabs>
-        <w:ind w:left="1800" w:hanging="360"/>
+        <w:ind w:left="1492" w:hanging="360"/>
       </w:pPr>
     </w:lvl>
   </w:abstractNum>
   <w:abstractNum w:abstractNumId="1" w15:restartNumberingAfterBreak="0">
     <w:nsid w:val="FFFFFF7D"/>
     <w:multiLevelType w:val="singleLevel"/>
-    <w:tmpl w:val="E4089024"/>
+    <w:tmpl w:val="DD021B7E"/>
     <w:lvl w:ilvl="0">
       <w:start w:val="1"/>
       <w:numFmt w:val="decimal"/>
+      <w:pStyle w:val="Listenumros4"/>
       <w:lvlText w:val="%1."/>
       <w:lvlJc w:val="left"/>
       <w:pPr>
         <w:tabs>
-          <w:tab w:val="num" w:pos="1440"/>
+          <w:tab w:val="num" w:pos="1209"/>
         </w:tabs>
-        <w:ind w:left="1440" w:hanging="360"/>
+        <w:ind w:left="1209" w:hanging="360"/>
       </w:pPr>
     </w:lvl>
   </w:abstractNum>
@@ -1847,12 +1696,34 @@
     </w:lvl>
   </w:abstractNum>
   <w:abstractNum w:abstractNumId="4" w15:restartNumberingAfterBreak="0">
-    <w:nsid w:val="FFFFFF81"/>
+    <w:nsid w:val="FFFFFF80"/>
     <w:multiLevelType w:val="singleLevel"/>
-    <w:tmpl w:val="171AC3A4"/>
+    <w:tmpl w:val="78F85FF2"/>
     <w:lvl w:ilvl="0">
       <w:start w:val="1"/>
       <w:numFmt w:val="bullet"/>
+      <w:pStyle w:val="Listepuces5"/>
+      <w:lvlText w:val=""/>
+      <w:lvlJc w:val="left"/>
+      <w:pPr>
+        <w:tabs>
+          <w:tab w:val="num" w:pos="1492"/>
+        </w:tabs>
+        <w:ind w:left="1492" w:hanging="360"/>
+      </w:pPr>
+      <w:rPr>
+        <w:rFonts w:ascii="Symbol" w:hAnsi="Symbol" w:hint="default"/>
+      </w:rPr>
+    </w:lvl>
+  </w:abstractNum>
+  <w:abstractNum w:abstractNumId="5" w15:restartNumberingAfterBreak="0">
+    <w:nsid w:val="FFFFFF81"/>
+    <w:multiLevelType w:val="singleLevel"/>
+    <w:tmpl w:val="E8FC9B94"/>
+    <w:lvl w:ilvl="0">
+      <w:start w:val="1"/>
+      <w:numFmt w:val="bullet"/>
+      <w:pStyle w:val="Listepuces4"/>
       <w:lvlText w:val=""/>
       <w:lvlJc w:val="left"/>
       <w:pPr>
@@ -1866,7 +1737,7 @@
       </w:rPr>
     </w:lvl>
   </w:abstractNum>
-  <w:abstractNum w:abstractNumId="5" w15:restartNumberingAfterBreak="0">
+  <w:abstractNum w:abstractNumId="6" w15:restartNumberingAfterBreak="0">
     <w:nsid w:val="FFFFFF82"/>
     <w:multiLevelType w:val="singleLevel"/>
     <w:tmpl w:val="F3EAFDEC"/>
@@ -1887,7 +1758,7 @@
       </w:rPr>
     </w:lvl>
   </w:abstractNum>
-  <w:abstractNum w:abstractNumId="6" w15:restartNumberingAfterBreak="0">
+  <w:abstractNum w:abstractNumId="7" w15:restartNumberingAfterBreak="0">
     <w:nsid w:val="FFFFFF83"/>
     <w:multiLevelType w:val="singleLevel"/>
     <w:tmpl w:val="3D1EFFD4"/>
@@ -1908,7 +1779,7 @@
       </w:rPr>
     </w:lvl>
   </w:abstractNum>
-  <w:abstractNum w:abstractNumId="7" w15:restartNumberingAfterBreak="0">
+  <w:abstractNum w:abstractNumId="8" w15:restartNumberingAfterBreak="0">
     <w:nsid w:val="FFFFFF88"/>
     <w:multiLevelType w:val="singleLevel"/>
     <w:tmpl w:val="D0A62B40"/>
@@ -1926,7 +1797,7 @@
       </w:pPr>
     </w:lvl>
   </w:abstractNum>
-  <w:abstractNum w:abstractNumId="8" w15:restartNumberingAfterBreak="0">
+  <w:abstractNum w:abstractNumId="9" w15:restartNumberingAfterBreak="0">
     <w:nsid w:val="FFFFFF89"/>
     <w:multiLevelType w:val="singleLevel"/>
     <w:tmpl w:val="4426DF14"/>
@@ -1948,19 +1819,19 @@
     </w:lvl>
   </w:abstractNum>
   <w:num w:numId="1" w16cid:durableId="199515172">
-    <w:abstractNumId w:val="8"/>
+    <w:abstractNumId w:val="9"/>
   </w:num>
   <w:num w:numId="2" w16cid:durableId="840580345">
+    <w:abstractNumId w:val="7"/>
+  </w:num>
+  <w:num w:numId="3" w16cid:durableId="1595432094">
     <w:abstractNumId w:val="6"/>
   </w:num>
-  <w:num w:numId="3" w16cid:durableId="1595432094">
+  <w:num w:numId="4" w16cid:durableId="1662781399">
     <w:abstractNumId w:val="5"/>
   </w:num>
-  <w:num w:numId="4" w16cid:durableId="1662781399">
-    <w:abstractNumId w:val="4"/>
-  </w:num>
   <w:num w:numId="5" w16cid:durableId="1432503842">
-    <w:abstractNumId w:val="7"/>
+    <w:abstractNumId w:val="8"/>
   </w:num>
   <w:num w:numId="6" w16cid:durableId="1072852554">
     <w:abstractNumId w:val="3"/>
@@ -1973,6 +1844,15 @@
   </w:num>
   <w:num w:numId="9" w16cid:durableId="1223831674">
     <w:abstractNumId w:val="0"/>
+  </w:num>
+  <w:num w:numId="10" w16cid:durableId="1086536833">
+    <w:abstractNumId w:val="1"/>
+  </w:num>
+  <w:num w:numId="11" w16cid:durableId="289434342">
+    <w:abstractNumId w:val="0"/>
+  </w:num>
+  <w:num w:numId="12" w16cid:durableId="931090038">
+    <w:abstractNumId w:val="4"/>
   </w:num>
 </w:numbering>
 </file>
@@ -13390,6 +13270,1130 @@
       <w:shd w:val="clear" w:color="auto" w:fill="E1DFDD"/>
     </w:rPr>
   </w:style>
+  <w:style w:type="paragraph" w:styleId="Adressedestinataire">
+    <w:name w:val="envelope address"/>
+    <w:basedOn w:val="Normal"/>
+    <w:uiPriority w:val="99"/>
+    <w:semiHidden/>
+    <w:unhideWhenUsed/>
+    <w:rsid w:val="009675FA"/>
+    <w:pPr>
+      <w:framePr w:w="7938" w:h="1985" w:hRule="exact" w:hSpace="141" w:wrap="auto" w:hAnchor="page" w:xAlign="center" w:yAlign="bottom"/>
+      <w:spacing w:after="0" w:line="240" w:lineRule="auto"/>
+      <w:ind w:left="2835"/>
+    </w:pPr>
+    <w:rPr>
+      <w:rFonts w:asciiTheme="majorHAnsi" w:eastAsiaTheme="majorEastAsia" w:hAnsiTheme="majorHAnsi" w:cstheme="majorBidi"/>
+      <w:sz w:val="24"/>
+      <w:szCs w:val="24"/>
+    </w:rPr>
+  </w:style>
+  <w:style w:type="paragraph" w:styleId="Adresseexpditeur">
+    <w:name w:val="envelope return"/>
+    <w:basedOn w:val="Normal"/>
+    <w:uiPriority w:val="99"/>
+    <w:semiHidden/>
+    <w:unhideWhenUsed/>
+    <w:rsid w:val="009675FA"/>
+    <w:pPr>
+      <w:spacing w:after="0" w:line="240" w:lineRule="auto"/>
+    </w:pPr>
+    <w:rPr>
+      <w:rFonts w:asciiTheme="majorHAnsi" w:eastAsiaTheme="majorEastAsia" w:hAnsiTheme="majorHAnsi" w:cstheme="majorBidi"/>
+      <w:sz w:val="20"/>
+      <w:szCs w:val="20"/>
+    </w:rPr>
+  </w:style>
+  <w:style w:type="paragraph" w:styleId="AdresseHTML">
+    <w:name w:val="HTML Address"/>
+    <w:basedOn w:val="Normal"/>
+    <w:link w:val="AdresseHTMLCar"/>
+    <w:uiPriority w:val="99"/>
+    <w:semiHidden/>
+    <w:unhideWhenUsed/>
+    <w:rsid w:val="009675FA"/>
+    <w:pPr>
+      <w:spacing w:after="0" w:line="240" w:lineRule="auto"/>
+    </w:pPr>
+    <w:rPr>
+      <w:i/>
+      <w:iCs/>
+    </w:rPr>
+  </w:style>
+  <w:style w:type="character" w:customStyle="1" w:styleId="AdresseHTMLCar">
+    <w:name w:val="Adresse HTML Car"/>
+    <w:basedOn w:val="Policepardfaut"/>
+    <w:link w:val="AdresseHTML"/>
+    <w:uiPriority w:val="99"/>
+    <w:semiHidden/>
+    <w:rsid w:val="009675FA"/>
+    <w:rPr>
+      <w:rFonts w:ascii="Calibri" w:eastAsia="Calibri" w:hAnsi="Calibri"/>
+      <w:i/>
+      <w:iCs/>
+      <w:color w:val="333333"/>
+      <w:sz w:val="18"/>
+      <w:lang w:val="fr-FR"/>
+    </w:rPr>
+  </w:style>
+  <w:style w:type="paragraph" w:styleId="Bibliographie">
+    <w:name w:val="Bibliography"/>
+    <w:basedOn w:val="Normal"/>
+    <w:next w:val="Normal"/>
+    <w:uiPriority w:val="37"/>
+    <w:semiHidden/>
+    <w:unhideWhenUsed/>
+    <w:rsid w:val="009675FA"/>
+  </w:style>
+  <w:style w:type="paragraph" w:styleId="Commentaire">
+    <w:name w:val="annotation text"/>
+    <w:basedOn w:val="Normal"/>
+    <w:link w:val="CommentaireCar"/>
+    <w:uiPriority w:val="99"/>
+    <w:semiHidden/>
+    <w:unhideWhenUsed/>
+    <w:rsid w:val="009675FA"/>
+    <w:pPr>
+      <w:spacing w:line="240" w:lineRule="auto"/>
+    </w:pPr>
+    <w:rPr>
+      <w:sz w:val="20"/>
+      <w:szCs w:val="20"/>
+    </w:rPr>
+  </w:style>
+  <w:style w:type="character" w:customStyle="1" w:styleId="CommentaireCar">
+    <w:name w:val="Commentaire Car"/>
+    <w:basedOn w:val="Policepardfaut"/>
+    <w:link w:val="Commentaire"/>
+    <w:uiPriority w:val="99"/>
+    <w:semiHidden/>
+    <w:rsid w:val="009675FA"/>
+    <w:rPr>
+      <w:rFonts w:ascii="Calibri" w:eastAsia="Calibri" w:hAnsi="Calibri"/>
+      <w:color w:val="333333"/>
+      <w:sz w:val="20"/>
+      <w:szCs w:val="20"/>
+      <w:lang w:val="fr-FR"/>
+    </w:rPr>
+  </w:style>
+  <w:style w:type="paragraph" w:styleId="Date">
+    <w:name w:val="Date"/>
+    <w:basedOn w:val="Normal"/>
+    <w:next w:val="Normal"/>
+    <w:link w:val="DateCar"/>
+    <w:uiPriority w:val="99"/>
+    <w:semiHidden/>
+    <w:unhideWhenUsed/>
+    <w:rsid w:val="009675FA"/>
+  </w:style>
+  <w:style w:type="character" w:customStyle="1" w:styleId="DateCar">
+    <w:name w:val="Date Car"/>
+    <w:basedOn w:val="Policepardfaut"/>
+    <w:link w:val="Date"/>
+    <w:uiPriority w:val="99"/>
+    <w:semiHidden/>
+    <w:rsid w:val="009675FA"/>
+    <w:rPr>
+      <w:rFonts w:ascii="Calibri" w:eastAsia="Calibri" w:hAnsi="Calibri"/>
+      <w:color w:val="333333"/>
+      <w:sz w:val="18"/>
+      <w:lang w:val="fr-FR"/>
+    </w:rPr>
+  </w:style>
+  <w:style w:type="paragraph" w:styleId="En-ttedemessage">
+    <w:name w:val="Message Header"/>
+    <w:basedOn w:val="Normal"/>
+    <w:link w:val="En-ttedemessageCar"/>
+    <w:uiPriority w:val="99"/>
+    <w:semiHidden/>
+    <w:unhideWhenUsed/>
+    <w:rsid w:val="009675FA"/>
+    <w:pPr>
+      <w:pBdr>
+        <w:top w:val="single" w:sz="6" w:space="1" w:color="auto"/>
+        <w:left w:val="single" w:sz="6" w:space="1" w:color="auto"/>
+        <w:bottom w:val="single" w:sz="6" w:space="1" w:color="auto"/>
+        <w:right w:val="single" w:sz="6" w:space="1" w:color="auto"/>
+      </w:pBdr>
+      <w:shd w:val="pct20" w:color="auto" w:fill="auto"/>
+      <w:spacing w:after="0" w:line="240" w:lineRule="auto"/>
+      <w:ind w:left="1134" w:hanging="1134"/>
+    </w:pPr>
+    <w:rPr>
+      <w:rFonts w:asciiTheme="majorHAnsi" w:eastAsiaTheme="majorEastAsia" w:hAnsiTheme="majorHAnsi" w:cstheme="majorBidi"/>
+      <w:sz w:val="24"/>
+      <w:szCs w:val="24"/>
+    </w:rPr>
+  </w:style>
+  <w:style w:type="character" w:customStyle="1" w:styleId="En-ttedemessageCar">
+    <w:name w:val="En-tête de message Car"/>
+    <w:basedOn w:val="Policepardfaut"/>
+    <w:link w:val="En-ttedemessage"/>
+    <w:uiPriority w:val="99"/>
+    <w:semiHidden/>
+    <w:rsid w:val="009675FA"/>
+    <w:rPr>
+      <w:rFonts w:asciiTheme="majorHAnsi" w:eastAsiaTheme="majorEastAsia" w:hAnsiTheme="majorHAnsi" w:cstheme="majorBidi"/>
+      <w:color w:val="333333"/>
+      <w:sz w:val="24"/>
+      <w:szCs w:val="24"/>
+      <w:shd w:val="pct20" w:color="auto" w:fill="auto"/>
+      <w:lang w:val="fr-FR"/>
+    </w:rPr>
+  </w:style>
+  <w:style w:type="paragraph" w:styleId="Explorateurdedocuments">
+    <w:name w:val="Document Map"/>
+    <w:basedOn w:val="Normal"/>
+    <w:link w:val="ExplorateurdedocumentsCar"/>
+    <w:uiPriority w:val="99"/>
+    <w:semiHidden/>
+    <w:unhideWhenUsed/>
+    <w:rsid w:val="009675FA"/>
+    <w:pPr>
+      <w:spacing w:after="0" w:line="240" w:lineRule="auto"/>
+    </w:pPr>
+    <w:rPr>
+      <w:rFonts w:ascii="Segoe UI" w:hAnsi="Segoe UI" w:cs="Segoe UI"/>
+      <w:sz w:val="16"/>
+      <w:szCs w:val="16"/>
+    </w:rPr>
+  </w:style>
+  <w:style w:type="character" w:customStyle="1" w:styleId="ExplorateurdedocumentsCar">
+    <w:name w:val="Explorateur de documents Car"/>
+    <w:basedOn w:val="Policepardfaut"/>
+    <w:link w:val="Explorateurdedocuments"/>
+    <w:uiPriority w:val="99"/>
+    <w:semiHidden/>
+    <w:rsid w:val="009675FA"/>
+    <w:rPr>
+      <w:rFonts w:ascii="Segoe UI" w:eastAsia="Calibri" w:hAnsi="Segoe UI" w:cs="Segoe UI"/>
+      <w:color w:val="333333"/>
+      <w:sz w:val="16"/>
+      <w:szCs w:val="16"/>
+      <w:lang w:val="fr-FR"/>
+    </w:rPr>
+  </w:style>
+  <w:style w:type="paragraph" w:styleId="Formuledepolitesse">
+    <w:name w:val="Closing"/>
+    <w:basedOn w:val="Normal"/>
+    <w:link w:val="FormuledepolitesseCar"/>
+    <w:uiPriority w:val="99"/>
+    <w:semiHidden/>
+    <w:unhideWhenUsed/>
+    <w:rsid w:val="009675FA"/>
+    <w:pPr>
+      <w:spacing w:after="0" w:line="240" w:lineRule="auto"/>
+      <w:ind w:left="4252"/>
+    </w:pPr>
+  </w:style>
+  <w:style w:type="character" w:customStyle="1" w:styleId="FormuledepolitesseCar">
+    <w:name w:val="Formule de politesse Car"/>
+    <w:basedOn w:val="Policepardfaut"/>
+    <w:link w:val="Formuledepolitesse"/>
+    <w:uiPriority w:val="99"/>
+    <w:semiHidden/>
+    <w:rsid w:val="009675FA"/>
+    <w:rPr>
+      <w:rFonts w:ascii="Calibri" w:eastAsia="Calibri" w:hAnsi="Calibri"/>
+      <w:color w:val="333333"/>
+      <w:sz w:val="18"/>
+      <w:lang w:val="fr-FR"/>
+    </w:rPr>
+  </w:style>
+  <w:style w:type="paragraph" w:styleId="Index1">
+    <w:name w:val="index 1"/>
+    <w:basedOn w:val="Normal"/>
+    <w:next w:val="Normal"/>
+    <w:autoRedefine/>
+    <w:uiPriority w:val="99"/>
+    <w:semiHidden/>
+    <w:unhideWhenUsed/>
+    <w:rsid w:val="009675FA"/>
+    <w:pPr>
+      <w:spacing w:after="0" w:line="240" w:lineRule="auto"/>
+      <w:ind w:left="180" w:hanging="180"/>
+    </w:pPr>
+  </w:style>
+  <w:style w:type="paragraph" w:styleId="Index2">
+    <w:name w:val="index 2"/>
+    <w:basedOn w:val="Normal"/>
+    <w:next w:val="Normal"/>
+    <w:autoRedefine/>
+    <w:uiPriority w:val="99"/>
+    <w:semiHidden/>
+    <w:unhideWhenUsed/>
+    <w:rsid w:val="009675FA"/>
+    <w:pPr>
+      <w:spacing w:after="0" w:line="240" w:lineRule="auto"/>
+      <w:ind w:left="360" w:hanging="180"/>
+    </w:pPr>
+  </w:style>
+  <w:style w:type="paragraph" w:styleId="Index3">
+    <w:name w:val="index 3"/>
+    <w:basedOn w:val="Normal"/>
+    <w:next w:val="Normal"/>
+    <w:autoRedefine/>
+    <w:uiPriority w:val="99"/>
+    <w:semiHidden/>
+    <w:unhideWhenUsed/>
+    <w:rsid w:val="009675FA"/>
+    <w:pPr>
+      <w:spacing w:after="0" w:line="240" w:lineRule="auto"/>
+      <w:ind w:left="540" w:hanging="180"/>
+    </w:pPr>
+  </w:style>
+  <w:style w:type="paragraph" w:styleId="Index4">
+    <w:name w:val="index 4"/>
+    <w:basedOn w:val="Normal"/>
+    <w:next w:val="Normal"/>
+    <w:autoRedefine/>
+    <w:uiPriority w:val="99"/>
+    <w:semiHidden/>
+    <w:unhideWhenUsed/>
+    <w:rsid w:val="009675FA"/>
+    <w:pPr>
+      <w:spacing w:after="0" w:line="240" w:lineRule="auto"/>
+      <w:ind w:left="720" w:hanging="180"/>
+    </w:pPr>
+  </w:style>
+  <w:style w:type="paragraph" w:styleId="Index5">
+    <w:name w:val="index 5"/>
+    <w:basedOn w:val="Normal"/>
+    <w:next w:val="Normal"/>
+    <w:autoRedefine/>
+    <w:uiPriority w:val="99"/>
+    <w:semiHidden/>
+    <w:unhideWhenUsed/>
+    <w:rsid w:val="009675FA"/>
+    <w:pPr>
+      <w:spacing w:after="0" w:line="240" w:lineRule="auto"/>
+      <w:ind w:left="900" w:hanging="180"/>
+    </w:pPr>
+  </w:style>
+  <w:style w:type="paragraph" w:styleId="Index6">
+    <w:name w:val="index 6"/>
+    <w:basedOn w:val="Normal"/>
+    <w:next w:val="Normal"/>
+    <w:autoRedefine/>
+    <w:uiPriority w:val="99"/>
+    <w:semiHidden/>
+    <w:unhideWhenUsed/>
+    <w:rsid w:val="009675FA"/>
+    <w:pPr>
+      <w:spacing w:after="0" w:line="240" w:lineRule="auto"/>
+      <w:ind w:left="1080" w:hanging="180"/>
+    </w:pPr>
+  </w:style>
+  <w:style w:type="paragraph" w:styleId="Index7">
+    <w:name w:val="index 7"/>
+    <w:basedOn w:val="Normal"/>
+    <w:next w:val="Normal"/>
+    <w:autoRedefine/>
+    <w:uiPriority w:val="99"/>
+    <w:semiHidden/>
+    <w:unhideWhenUsed/>
+    <w:rsid w:val="009675FA"/>
+    <w:pPr>
+      <w:spacing w:after="0" w:line="240" w:lineRule="auto"/>
+      <w:ind w:left="1260" w:hanging="180"/>
+    </w:pPr>
+  </w:style>
+  <w:style w:type="paragraph" w:styleId="Index8">
+    <w:name w:val="index 8"/>
+    <w:basedOn w:val="Normal"/>
+    <w:next w:val="Normal"/>
+    <w:autoRedefine/>
+    <w:uiPriority w:val="99"/>
+    <w:semiHidden/>
+    <w:unhideWhenUsed/>
+    <w:rsid w:val="009675FA"/>
+    <w:pPr>
+      <w:spacing w:after="0" w:line="240" w:lineRule="auto"/>
+      <w:ind w:left="1440" w:hanging="180"/>
+    </w:pPr>
+  </w:style>
+  <w:style w:type="paragraph" w:styleId="Index9">
+    <w:name w:val="index 9"/>
+    <w:basedOn w:val="Normal"/>
+    <w:next w:val="Normal"/>
+    <w:autoRedefine/>
+    <w:uiPriority w:val="99"/>
+    <w:semiHidden/>
+    <w:unhideWhenUsed/>
+    <w:rsid w:val="009675FA"/>
+    <w:pPr>
+      <w:spacing w:after="0" w:line="240" w:lineRule="auto"/>
+      <w:ind w:left="1620" w:hanging="180"/>
+    </w:pPr>
+  </w:style>
+  <w:style w:type="paragraph" w:styleId="Liste4">
+    <w:name w:val="List 4"/>
+    <w:basedOn w:val="Normal"/>
+    <w:uiPriority w:val="99"/>
+    <w:semiHidden/>
+    <w:unhideWhenUsed/>
+    <w:rsid w:val="009675FA"/>
+    <w:pPr>
+      <w:ind w:left="1132" w:hanging="283"/>
+      <w:contextualSpacing/>
+    </w:pPr>
+  </w:style>
+  <w:style w:type="paragraph" w:styleId="Liste5">
+    <w:name w:val="List 5"/>
+    <w:basedOn w:val="Normal"/>
+    <w:uiPriority w:val="99"/>
+    <w:semiHidden/>
+    <w:unhideWhenUsed/>
+    <w:rsid w:val="009675FA"/>
+    <w:pPr>
+      <w:ind w:left="1415" w:hanging="283"/>
+      <w:contextualSpacing/>
+    </w:pPr>
+  </w:style>
+  <w:style w:type="paragraph" w:styleId="Listenumros4">
+    <w:name w:val="List Number 4"/>
+    <w:basedOn w:val="Normal"/>
+    <w:uiPriority w:val="99"/>
+    <w:semiHidden/>
+    <w:unhideWhenUsed/>
+    <w:rsid w:val="009675FA"/>
+    <w:pPr>
+      <w:numPr>
+        <w:numId w:val="10"/>
+      </w:numPr>
+      <w:contextualSpacing/>
+    </w:pPr>
+  </w:style>
+  <w:style w:type="paragraph" w:styleId="Listenumros5">
+    <w:name w:val="List Number 5"/>
+    <w:basedOn w:val="Normal"/>
+    <w:uiPriority w:val="99"/>
+    <w:semiHidden/>
+    <w:unhideWhenUsed/>
+    <w:rsid w:val="009675FA"/>
+    <w:pPr>
+      <w:numPr>
+        <w:numId w:val="11"/>
+      </w:numPr>
+      <w:contextualSpacing/>
+    </w:pPr>
+  </w:style>
+  <w:style w:type="paragraph" w:styleId="Listepuces4">
+    <w:name w:val="List Bullet 4"/>
+    <w:basedOn w:val="Normal"/>
+    <w:uiPriority w:val="99"/>
+    <w:semiHidden/>
+    <w:unhideWhenUsed/>
+    <w:rsid w:val="009675FA"/>
+    <w:pPr>
+      <w:numPr>
+        <w:numId w:val="4"/>
+      </w:numPr>
+      <w:contextualSpacing/>
+    </w:pPr>
+  </w:style>
+  <w:style w:type="paragraph" w:styleId="Listepuces5">
+    <w:name w:val="List Bullet 5"/>
+    <w:basedOn w:val="Normal"/>
+    <w:uiPriority w:val="99"/>
+    <w:semiHidden/>
+    <w:unhideWhenUsed/>
+    <w:rsid w:val="009675FA"/>
+    <w:pPr>
+      <w:numPr>
+        <w:numId w:val="12"/>
+      </w:numPr>
+      <w:contextualSpacing/>
+    </w:pPr>
+  </w:style>
+  <w:style w:type="paragraph" w:styleId="Listecontinue4">
+    <w:name w:val="List Continue 4"/>
+    <w:basedOn w:val="Normal"/>
+    <w:uiPriority w:val="99"/>
+    <w:semiHidden/>
+    <w:unhideWhenUsed/>
+    <w:rsid w:val="009675FA"/>
+    <w:pPr>
+      <w:spacing w:after="120"/>
+      <w:ind w:left="1132"/>
+      <w:contextualSpacing/>
+    </w:pPr>
+  </w:style>
+  <w:style w:type="paragraph" w:styleId="Listecontinue5">
+    <w:name w:val="List Continue 5"/>
+    <w:basedOn w:val="Normal"/>
+    <w:uiPriority w:val="99"/>
+    <w:semiHidden/>
+    <w:unhideWhenUsed/>
+    <w:rsid w:val="009675FA"/>
+    <w:pPr>
+      <w:spacing w:after="120"/>
+      <w:ind w:left="1415"/>
+      <w:contextualSpacing/>
+    </w:pPr>
+  </w:style>
+  <w:style w:type="paragraph" w:styleId="NormalWeb">
+    <w:name w:val="Normal (Web)"/>
+    <w:basedOn w:val="Normal"/>
+    <w:uiPriority w:val="99"/>
+    <w:semiHidden/>
+    <w:unhideWhenUsed/>
+    <w:rsid w:val="009675FA"/>
+    <w:rPr>
+      <w:rFonts w:ascii="Times New Roman" w:hAnsi="Times New Roman" w:cs="Times New Roman"/>
+      <w:sz w:val="24"/>
+      <w:szCs w:val="24"/>
+    </w:rPr>
+  </w:style>
+  <w:style w:type="paragraph" w:styleId="Normalcentr">
+    <w:name w:val="Block Text"/>
+    <w:basedOn w:val="Normal"/>
+    <w:uiPriority w:val="99"/>
+    <w:semiHidden/>
+    <w:unhideWhenUsed/>
+    <w:rsid w:val="009675FA"/>
+    <w:pPr>
+      <w:pBdr>
+        <w:top w:val="single" w:sz="2" w:space="10" w:color="4F81BD" w:themeColor="accent1"/>
+        <w:left w:val="single" w:sz="2" w:space="10" w:color="4F81BD" w:themeColor="accent1"/>
+        <w:bottom w:val="single" w:sz="2" w:space="10" w:color="4F81BD" w:themeColor="accent1"/>
+        <w:right w:val="single" w:sz="2" w:space="10" w:color="4F81BD" w:themeColor="accent1"/>
+      </w:pBdr>
+      <w:ind w:left="1152" w:right="1152"/>
+    </w:pPr>
+    <w:rPr>
+      <w:rFonts w:asciiTheme="minorHAnsi" w:eastAsiaTheme="minorEastAsia" w:hAnsiTheme="minorHAnsi"/>
+      <w:i/>
+      <w:iCs/>
+      <w:color w:val="4F81BD" w:themeColor="accent1"/>
+    </w:rPr>
+  </w:style>
+  <w:style w:type="paragraph" w:styleId="Notedebasdepage">
+    <w:name w:val="footnote text"/>
+    <w:basedOn w:val="Normal"/>
+    <w:link w:val="NotedebasdepageCar"/>
+    <w:uiPriority w:val="99"/>
+    <w:semiHidden/>
+    <w:unhideWhenUsed/>
+    <w:rsid w:val="009675FA"/>
+    <w:pPr>
+      <w:spacing w:after="0" w:line="240" w:lineRule="auto"/>
+    </w:pPr>
+    <w:rPr>
+      <w:sz w:val="20"/>
+      <w:szCs w:val="20"/>
+    </w:rPr>
+  </w:style>
+  <w:style w:type="character" w:customStyle="1" w:styleId="NotedebasdepageCar">
+    <w:name w:val="Note de bas de page Car"/>
+    <w:basedOn w:val="Policepardfaut"/>
+    <w:link w:val="Notedebasdepage"/>
+    <w:uiPriority w:val="99"/>
+    <w:semiHidden/>
+    <w:rsid w:val="009675FA"/>
+    <w:rPr>
+      <w:rFonts w:ascii="Calibri" w:eastAsia="Calibri" w:hAnsi="Calibri"/>
+      <w:color w:val="333333"/>
+      <w:sz w:val="20"/>
+      <w:szCs w:val="20"/>
+      <w:lang w:val="fr-FR"/>
+    </w:rPr>
+  </w:style>
+  <w:style w:type="paragraph" w:styleId="Notedefin">
+    <w:name w:val="endnote text"/>
+    <w:basedOn w:val="Normal"/>
+    <w:link w:val="NotedefinCar"/>
+    <w:uiPriority w:val="99"/>
+    <w:semiHidden/>
+    <w:unhideWhenUsed/>
+    <w:rsid w:val="009675FA"/>
+    <w:pPr>
+      <w:spacing w:after="0" w:line="240" w:lineRule="auto"/>
+    </w:pPr>
+    <w:rPr>
+      <w:sz w:val="20"/>
+      <w:szCs w:val="20"/>
+    </w:rPr>
+  </w:style>
+  <w:style w:type="character" w:customStyle="1" w:styleId="NotedefinCar">
+    <w:name w:val="Note de fin Car"/>
+    <w:basedOn w:val="Policepardfaut"/>
+    <w:link w:val="Notedefin"/>
+    <w:uiPriority w:val="99"/>
+    <w:semiHidden/>
+    <w:rsid w:val="009675FA"/>
+    <w:rPr>
+      <w:rFonts w:ascii="Calibri" w:eastAsia="Calibri" w:hAnsi="Calibri"/>
+      <w:color w:val="333333"/>
+      <w:sz w:val="20"/>
+      <w:szCs w:val="20"/>
+      <w:lang w:val="fr-FR"/>
+    </w:rPr>
+  </w:style>
+  <w:style w:type="paragraph" w:styleId="Objetducommentaire">
+    <w:name w:val="annotation subject"/>
+    <w:basedOn w:val="Commentaire"/>
+    <w:next w:val="Commentaire"/>
+    <w:link w:val="ObjetducommentaireCar"/>
+    <w:uiPriority w:val="99"/>
+    <w:semiHidden/>
+    <w:unhideWhenUsed/>
+    <w:rsid w:val="009675FA"/>
+    <w:rPr>
+      <w:b/>
+      <w:bCs/>
+    </w:rPr>
+  </w:style>
+  <w:style w:type="character" w:customStyle="1" w:styleId="ObjetducommentaireCar">
+    <w:name w:val="Objet du commentaire Car"/>
+    <w:basedOn w:val="CommentaireCar"/>
+    <w:link w:val="Objetducommentaire"/>
+    <w:uiPriority w:val="99"/>
+    <w:semiHidden/>
+    <w:rsid w:val="009675FA"/>
+    <w:rPr>
+      <w:rFonts w:ascii="Calibri" w:eastAsia="Calibri" w:hAnsi="Calibri"/>
+      <w:b/>
+      <w:bCs/>
+      <w:color w:val="333333"/>
+      <w:sz w:val="20"/>
+      <w:szCs w:val="20"/>
+      <w:lang w:val="fr-FR"/>
+    </w:rPr>
+  </w:style>
+  <w:style w:type="paragraph" w:styleId="PrformatHTML">
+    <w:name w:val="HTML Preformatted"/>
+    <w:basedOn w:val="Normal"/>
+    <w:link w:val="PrformatHTMLCar"/>
+    <w:uiPriority w:val="99"/>
+    <w:semiHidden/>
+    <w:unhideWhenUsed/>
+    <w:rsid w:val="009675FA"/>
+    <w:pPr>
+      <w:spacing w:after="0" w:line="240" w:lineRule="auto"/>
+    </w:pPr>
+    <w:rPr>
+      <w:rFonts w:ascii="Consolas" w:hAnsi="Consolas"/>
+      <w:sz w:val="20"/>
+      <w:szCs w:val="20"/>
+    </w:rPr>
+  </w:style>
+  <w:style w:type="character" w:customStyle="1" w:styleId="PrformatHTMLCar">
+    <w:name w:val="Préformaté HTML Car"/>
+    <w:basedOn w:val="Policepardfaut"/>
+    <w:link w:val="PrformatHTML"/>
+    <w:uiPriority w:val="99"/>
+    <w:semiHidden/>
+    <w:rsid w:val="009675FA"/>
+    <w:rPr>
+      <w:rFonts w:ascii="Consolas" w:eastAsia="Calibri" w:hAnsi="Consolas"/>
+      <w:color w:val="333333"/>
+      <w:sz w:val="20"/>
+      <w:szCs w:val="20"/>
+      <w:lang w:val="fr-FR"/>
+    </w:rPr>
+  </w:style>
+  <w:style w:type="paragraph" w:styleId="Retrait1religne">
+    <w:name w:val="Body Text First Indent"/>
+    <w:basedOn w:val="Corpsdetexte"/>
+    <w:link w:val="Retrait1religneCar"/>
+    <w:uiPriority w:val="99"/>
+    <w:semiHidden/>
+    <w:unhideWhenUsed/>
+    <w:rsid w:val="009675FA"/>
+    <w:pPr>
+      <w:spacing w:after="40"/>
+      <w:ind w:firstLine="360"/>
+    </w:pPr>
+  </w:style>
+  <w:style w:type="character" w:customStyle="1" w:styleId="Retrait1religneCar">
+    <w:name w:val="Retrait 1re ligne Car"/>
+    <w:basedOn w:val="CorpsdetexteCar"/>
+    <w:link w:val="Retrait1religne"/>
+    <w:uiPriority w:val="99"/>
+    <w:semiHidden/>
+    <w:rsid w:val="009675FA"/>
+    <w:rPr>
+      <w:rFonts w:ascii="Calibri" w:eastAsia="Calibri" w:hAnsi="Calibri"/>
+      <w:color w:val="333333"/>
+      <w:sz w:val="18"/>
+      <w:lang w:val="fr-FR"/>
+    </w:rPr>
+  </w:style>
+  <w:style w:type="paragraph" w:styleId="Retraitcorpsdetexte">
+    <w:name w:val="Body Text Indent"/>
+    <w:basedOn w:val="Normal"/>
+    <w:link w:val="RetraitcorpsdetexteCar"/>
+    <w:uiPriority w:val="99"/>
+    <w:semiHidden/>
+    <w:unhideWhenUsed/>
+    <w:rsid w:val="009675FA"/>
+    <w:pPr>
+      <w:spacing w:after="120"/>
+      <w:ind w:left="283"/>
+    </w:pPr>
+  </w:style>
+  <w:style w:type="character" w:customStyle="1" w:styleId="RetraitcorpsdetexteCar">
+    <w:name w:val="Retrait corps de texte Car"/>
+    <w:basedOn w:val="Policepardfaut"/>
+    <w:link w:val="Retraitcorpsdetexte"/>
+    <w:uiPriority w:val="99"/>
+    <w:semiHidden/>
+    <w:rsid w:val="009675FA"/>
+    <w:rPr>
+      <w:rFonts w:ascii="Calibri" w:eastAsia="Calibri" w:hAnsi="Calibri"/>
+      <w:color w:val="333333"/>
+      <w:sz w:val="18"/>
+      <w:lang w:val="fr-FR"/>
+    </w:rPr>
+  </w:style>
+  <w:style w:type="paragraph" w:styleId="Retraitcorpsdetexte2">
+    <w:name w:val="Body Text Indent 2"/>
+    <w:basedOn w:val="Normal"/>
+    <w:link w:val="Retraitcorpsdetexte2Car"/>
+    <w:uiPriority w:val="99"/>
+    <w:semiHidden/>
+    <w:unhideWhenUsed/>
+    <w:rsid w:val="009675FA"/>
+    <w:pPr>
+      <w:spacing w:after="120" w:line="480" w:lineRule="auto"/>
+      <w:ind w:left="283"/>
+    </w:pPr>
+  </w:style>
+  <w:style w:type="character" w:customStyle="1" w:styleId="Retraitcorpsdetexte2Car">
+    <w:name w:val="Retrait corps de texte 2 Car"/>
+    <w:basedOn w:val="Policepardfaut"/>
+    <w:link w:val="Retraitcorpsdetexte2"/>
+    <w:uiPriority w:val="99"/>
+    <w:semiHidden/>
+    <w:rsid w:val="009675FA"/>
+    <w:rPr>
+      <w:rFonts w:ascii="Calibri" w:eastAsia="Calibri" w:hAnsi="Calibri"/>
+      <w:color w:val="333333"/>
+      <w:sz w:val="18"/>
+      <w:lang w:val="fr-FR"/>
+    </w:rPr>
+  </w:style>
+  <w:style w:type="paragraph" w:styleId="Retraitcorpsdetexte3">
+    <w:name w:val="Body Text Indent 3"/>
+    <w:basedOn w:val="Normal"/>
+    <w:link w:val="Retraitcorpsdetexte3Car"/>
+    <w:uiPriority w:val="99"/>
+    <w:semiHidden/>
+    <w:unhideWhenUsed/>
+    <w:rsid w:val="009675FA"/>
+    <w:pPr>
+      <w:spacing w:after="120"/>
+      <w:ind w:left="283"/>
+    </w:pPr>
+    <w:rPr>
+      <w:sz w:val="16"/>
+      <w:szCs w:val="16"/>
+    </w:rPr>
+  </w:style>
+  <w:style w:type="character" w:customStyle="1" w:styleId="Retraitcorpsdetexte3Car">
+    <w:name w:val="Retrait corps de texte 3 Car"/>
+    <w:basedOn w:val="Policepardfaut"/>
+    <w:link w:val="Retraitcorpsdetexte3"/>
+    <w:uiPriority w:val="99"/>
+    <w:semiHidden/>
+    <w:rsid w:val="009675FA"/>
+    <w:rPr>
+      <w:rFonts w:ascii="Calibri" w:eastAsia="Calibri" w:hAnsi="Calibri"/>
+      <w:color w:val="333333"/>
+      <w:sz w:val="16"/>
+      <w:szCs w:val="16"/>
+      <w:lang w:val="fr-FR"/>
+    </w:rPr>
+  </w:style>
+  <w:style w:type="paragraph" w:styleId="Retraitcorpset1relig">
+    <w:name w:val="Body Text First Indent 2"/>
+    <w:basedOn w:val="Retraitcorpsdetexte"/>
+    <w:link w:val="Retraitcorpset1religCar"/>
+    <w:uiPriority w:val="99"/>
+    <w:semiHidden/>
+    <w:unhideWhenUsed/>
+    <w:rsid w:val="009675FA"/>
+    <w:pPr>
+      <w:spacing w:after="40"/>
+      <w:ind w:left="360" w:firstLine="360"/>
+    </w:pPr>
+  </w:style>
+  <w:style w:type="character" w:customStyle="1" w:styleId="Retraitcorpset1religCar">
+    <w:name w:val="Retrait corps et 1re lig. Car"/>
+    <w:basedOn w:val="RetraitcorpsdetexteCar"/>
+    <w:link w:val="Retraitcorpset1relig"/>
+    <w:uiPriority w:val="99"/>
+    <w:semiHidden/>
+    <w:rsid w:val="009675FA"/>
+    <w:rPr>
+      <w:rFonts w:ascii="Calibri" w:eastAsia="Calibri" w:hAnsi="Calibri"/>
+      <w:color w:val="333333"/>
+      <w:sz w:val="18"/>
+      <w:lang w:val="fr-FR"/>
+    </w:rPr>
+  </w:style>
+  <w:style w:type="paragraph" w:styleId="Retraitnormal">
+    <w:name w:val="Normal Indent"/>
+    <w:basedOn w:val="Normal"/>
+    <w:uiPriority w:val="99"/>
+    <w:semiHidden/>
+    <w:unhideWhenUsed/>
+    <w:rsid w:val="009675FA"/>
+    <w:pPr>
+      <w:ind w:left="708"/>
+    </w:pPr>
+  </w:style>
+  <w:style w:type="paragraph" w:styleId="Salutations">
+    <w:name w:val="Salutation"/>
+    <w:basedOn w:val="Normal"/>
+    <w:next w:val="Normal"/>
+    <w:link w:val="SalutationsCar"/>
+    <w:uiPriority w:val="99"/>
+    <w:semiHidden/>
+    <w:unhideWhenUsed/>
+    <w:rsid w:val="009675FA"/>
+  </w:style>
+  <w:style w:type="character" w:customStyle="1" w:styleId="SalutationsCar">
+    <w:name w:val="Salutations Car"/>
+    <w:basedOn w:val="Policepardfaut"/>
+    <w:link w:val="Salutations"/>
+    <w:uiPriority w:val="99"/>
+    <w:semiHidden/>
+    <w:rsid w:val="009675FA"/>
+    <w:rPr>
+      <w:rFonts w:ascii="Calibri" w:eastAsia="Calibri" w:hAnsi="Calibri"/>
+      <w:color w:val="333333"/>
+      <w:sz w:val="18"/>
+      <w:lang w:val="fr-FR"/>
+    </w:rPr>
+  </w:style>
+  <w:style w:type="paragraph" w:styleId="Signature">
+    <w:name w:val="Signature"/>
+    <w:basedOn w:val="Normal"/>
+    <w:link w:val="SignatureCar"/>
+    <w:uiPriority w:val="99"/>
+    <w:semiHidden/>
+    <w:unhideWhenUsed/>
+    <w:rsid w:val="009675FA"/>
+    <w:pPr>
+      <w:spacing w:after="0" w:line="240" w:lineRule="auto"/>
+      <w:ind w:left="4252"/>
+    </w:pPr>
+  </w:style>
+  <w:style w:type="character" w:customStyle="1" w:styleId="SignatureCar">
+    <w:name w:val="Signature Car"/>
+    <w:basedOn w:val="Policepardfaut"/>
+    <w:link w:val="Signature"/>
+    <w:uiPriority w:val="99"/>
+    <w:semiHidden/>
+    <w:rsid w:val="009675FA"/>
+    <w:rPr>
+      <w:rFonts w:ascii="Calibri" w:eastAsia="Calibri" w:hAnsi="Calibri"/>
+      <w:color w:val="333333"/>
+      <w:sz w:val="18"/>
+      <w:lang w:val="fr-FR"/>
+    </w:rPr>
+  </w:style>
+  <w:style w:type="paragraph" w:styleId="Signaturelectronique">
+    <w:name w:val="E-mail Signature"/>
+    <w:basedOn w:val="Normal"/>
+    <w:link w:val="SignaturelectroniqueCar"/>
+    <w:uiPriority w:val="99"/>
+    <w:semiHidden/>
+    <w:unhideWhenUsed/>
+    <w:rsid w:val="009675FA"/>
+    <w:pPr>
+      <w:spacing w:after="0" w:line="240" w:lineRule="auto"/>
+    </w:pPr>
+  </w:style>
+  <w:style w:type="character" w:customStyle="1" w:styleId="SignaturelectroniqueCar">
+    <w:name w:val="Signature électronique Car"/>
+    <w:basedOn w:val="Policepardfaut"/>
+    <w:link w:val="Signaturelectronique"/>
+    <w:uiPriority w:val="99"/>
+    <w:semiHidden/>
+    <w:rsid w:val="009675FA"/>
+    <w:rPr>
+      <w:rFonts w:ascii="Calibri" w:eastAsia="Calibri" w:hAnsi="Calibri"/>
+      <w:color w:val="333333"/>
+      <w:sz w:val="18"/>
+      <w:lang w:val="fr-FR"/>
+    </w:rPr>
+  </w:style>
+  <w:style w:type="paragraph" w:styleId="Tabledesillustrations">
+    <w:name w:val="table of figures"/>
+    <w:basedOn w:val="Normal"/>
+    <w:next w:val="Normal"/>
+    <w:uiPriority w:val="99"/>
+    <w:semiHidden/>
+    <w:unhideWhenUsed/>
+    <w:rsid w:val="009675FA"/>
+    <w:pPr>
+      <w:spacing w:after="0"/>
+    </w:pPr>
+  </w:style>
+  <w:style w:type="paragraph" w:styleId="Tabledesrfrencesjuridiques">
+    <w:name w:val="table of authorities"/>
+    <w:basedOn w:val="Normal"/>
+    <w:next w:val="Normal"/>
+    <w:uiPriority w:val="99"/>
+    <w:semiHidden/>
+    <w:unhideWhenUsed/>
+    <w:rsid w:val="009675FA"/>
+    <w:pPr>
+      <w:spacing w:after="0"/>
+      <w:ind w:left="180" w:hanging="180"/>
+    </w:pPr>
+  </w:style>
+  <w:style w:type="paragraph" w:styleId="Textebrut">
+    <w:name w:val="Plain Text"/>
+    <w:basedOn w:val="Normal"/>
+    <w:link w:val="TextebrutCar"/>
+    <w:uiPriority w:val="99"/>
+    <w:semiHidden/>
+    <w:unhideWhenUsed/>
+    <w:rsid w:val="009675FA"/>
+    <w:pPr>
+      <w:spacing w:after="0" w:line="240" w:lineRule="auto"/>
+    </w:pPr>
+    <w:rPr>
+      <w:rFonts w:ascii="Consolas" w:hAnsi="Consolas"/>
+      <w:sz w:val="21"/>
+      <w:szCs w:val="21"/>
+    </w:rPr>
+  </w:style>
+  <w:style w:type="character" w:customStyle="1" w:styleId="TextebrutCar">
+    <w:name w:val="Texte brut Car"/>
+    <w:basedOn w:val="Policepardfaut"/>
+    <w:link w:val="Textebrut"/>
+    <w:uiPriority w:val="99"/>
+    <w:semiHidden/>
+    <w:rsid w:val="009675FA"/>
+    <w:rPr>
+      <w:rFonts w:ascii="Consolas" w:eastAsia="Calibri" w:hAnsi="Consolas"/>
+      <w:color w:val="333333"/>
+      <w:sz w:val="21"/>
+      <w:szCs w:val="21"/>
+      <w:lang w:val="fr-FR"/>
+    </w:rPr>
+  </w:style>
+  <w:style w:type="paragraph" w:styleId="Textedebulles">
+    <w:name w:val="Balloon Text"/>
+    <w:basedOn w:val="Normal"/>
+    <w:link w:val="TextedebullesCar"/>
+    <w:uiPriority w:val="99"/>
+    <w:semiHidden/>
+    <w:unhideWhenUsed/>
+    <w:rsid w:val="009675FA"/>
+    <w:pPr>
+      <w:spacing w:after="0" w:line="240" w:lineRule="auto"/>
+    </w:pPr>
+    <w:rPr>
+      <w:rFonts w:ascii="Segoe UI" w:hAnsi="Segoe UI" w:cs="Segoe UI"/>
+      <w:szCs w:val="18"/>
+    </w:rPr>
+  </w:style>
+  <w:style w:type="character" w:customStyle="1" w:styleId="TextedebullesCar">
+    <w:name w:val="Texte de bulles Car"/>
+    <w:basedOn w:val="Policepardfaut"/>
+    <w:link w:val="Textedebulles"/>
+    <w:uiPriority w:val="99"/>
+    <w:semiHidden/>
+    <w:rsid w:val="009675FA"/>
+    <w:rPr>
+      <w:rFonts w:ascii="Segoe UI" w:eastAsia="Calibri" w:hAnsi="Segoe UI" w:cs="Segoe UI"/>
+      <w:color w:val="333333"/>
+      <w:sz w:val="18"/>
+      <w:szCs w:val="18"/>
+      <w:lang w:val="fr-FR"/>
+    </w:rPr>
+  </w:style>
+  <w:style w:type="paragraph" w:styleId="Titredenote">
+    <w:name w:val="Note Heading"/>
+    <w:basedOn w:val="Normal"/>
+    <w:next w:val="Normal"/>
+    <w:link w:val="TitredenoteCar"/>
+    <w:uiPriority w:val="99"/>
+    <w:semiHidden/>
+    <w:unhideWhenUsed/>
+    <w:rsid w:val="009675FA"/>
+    <w:pPr>
+      <w:spacing w:after="0" w:line="240" w:lineRule="auto"/>
+    </w:pPr>
+  </w:style>
+  <w:style w:type="character" w:customStyle="1" w:styleId="TitredenoteCar">
+    <w:name w:val="Titre de note Car"/>
+    <w:basedOn w:val="Policepardfaut"/>
+    <w:link w:val="Titredenote"/>
+    <w:uiPriority w:val="99"/>
+    <w:semiHidden/>
+    <w:rsid w:val="009675FA"/>
+    <w:rPr>
+      <w:rFonts w:ascii="Calibri" w:eastAsia="Calibri" w:hAnsi="Calibri"/>
+      <w:color w:val="333333"/>
+      <w:sz w:val="18"/>
+      <w:lang w:val="fr-FR"/>
+    </w:rPr>
+  </w:style>
+  <w:style w:type="paragraph" w:styleId="Titreindex">
+    <w:name w:val="index heading"/>
+    <w:basedOn w:val="Normal"/>
+    <w:next w:val="Index1"/>
+    <w:uiPriority w:val="99"/>
+    <w:semiHidden/>
+    <w:unhideWhenUsed/>
+    <w:rsid w:val="009675FA"/>
+    <w:rPr>
+      <w:rFonts w:asciiTheme="majorHAnsi" w:eastAsiaTheme="majorEastAsia" w:hAnsiTheme="majorHAnsi" w:cstheme="majorBidi"/>
+      <w:b/>
+      <w:bCs/>
+    </w:rPr>
+  </w:style>
+  <w:style w:type="paragraph" w:styleId="TitreTR">
+    <w:name w:val="toa heading"/>
+    <w:basedOn w:val="Normal"/>
+    <w:next w:val="Normal"/>
+    <w:uiPriority w:val="99"/>
+    <w:semiHidden/>
+    <w:unhideWhenUsed/>
+    <w:rsid w:val="009675FA"/>
+    <w:pPr>
+      <w:spacing w:before="120"/>
+    </w:pPr>
+    <w:rPr>
+      <w:rFonts w:asciiTheme="majorHAnsi" w:eastAsiaTheme="majorEastAsia" w:hAnsiTheme="majorHAnsi" w:cstheme="majorBidi"/>
+      <w:b/>
+      <w:bCs/>
+      <w:sz w:val="24"/>
+      <w:szCs w:val="24"/>
+    </w:rPr>
+  </w:style>
+  <w:style w:type="paragraph" w:styleId="TM1">
+    <w:name w:val="toc 1"/>
+    <w:basedOn w:val="Normal"/>
+    <w:next w:val="Normal"/>
+    <w:autoRedefine/>
+    <w:uiPriority w:val="39"/>
+    <w:semiHidden/>
+    <w:unhideWhenUsed/>
+    <w:rsid w:val="009675FA"/>
+    <w:pPr>
+      <w:spacing w:after="100"/>
+    </w:pPr>
+  </w:style>
+  <w:style w:type="paragraph" w:styleId="TM2">
+    <w:name w:val="toc 2"/>
+    <w:basedOn w:val="Normal"/>
+    <w:next w:val="Normal"/>
+    <w:autoRedefine/>
+    <w:uiPriority w:val="39"/>
+    <w:semiHidden/>
+    <w:unhideWhenUsed/>
+    <w:rsid w:val="009675FA"/>
+    <w:pPr>
+      <w:spacing w:after="100"/>
+      <w:ind w:left="180"/>
+    </w:pPr>
+  </w:style>
+  <w:style w:type="paragraph" w:styleId="TM3">
+    <w:name w:val="toc 3"/>
+    <w:basedOn w:val="Normal"/>
+    <w:next w:val="Normal"/>
+    <w:autoRedefine/>
+    <w:uiPriority w:val="39"/>
+    <w:semiHidden/>
+    <w:unhideWhenUsed/>
+    <w:rsid w:val="009675FA"/>
+    <w:pPr>
+      <w:spacing w:after="100"/>
+      <w:ind w:left="360"/>
+    </w:pPr>
+  </w:style>
+  <w:style w:type="paragraph" w:styleId="TM4">
+    <w:name w:val="toc 4"/>
+    <w:basedOn w:val="Normal"/>
+    <w:next w:val="Normal"/>
+    <w:autoRedefine/>
+    <w:uiPriority w:val="39"/>
+    <w:semiHidden/>
+    <w:unhideWhenUsed/>
+    <w:rsid w:val="009675FA"/>
+    <w:pPr>
+      <w:spacing w:after="100"/>
+      <w:ind w:left="540"/>
+    </w:pPr>
+  </w:style>
+  <w:style w:type="paragraph" w:styleId="TM5">
+    <w:name w:val="toc 5"/>
+    <w:basedOn w:val="Normal"/>
+    <w:next w:val="Normal"/>
+    <w:autoRedefine/>
+    <w:uiPriority w:val="39"/>
+    <w:semiHidden/>
+    <w:unhideWhenUsed/>
+    <w:rsid w:val="009675FA"/>
+    <w:pPr>
+      <w:spacing w:after="100"/>
+      <w:ind w:left="720"/>
+    </w:pPr>
+  </w:style>
+  <w:style w:type="paragraph" w:styleId="TM6">
+    <w:name w:val="toc 6"/>
+    <w:basedOn w:val="Normal"/>
+    <w:next w:val="Normal"/>
+    <w:autoRedefine/>
+    <w:uiPriority w:val="39"/>
+    <w:semiHidden/>
+    <w:unhideWhenUsed/>
+    <w:rsid w:val="009675FA"/>
+    <w:pPr>
+      <w:spacing w:after="100"/>
+      <w:ind w:left="900"/>
+    </w:pPr>
+  </w:style>
+  <w:style w:type="paragraph" w:styleId="TM7">
+    <w:name w:val="toc 7"/>
+    <w:basedOn w:val="Normal"/>
+    <w:next w:val="Normal"/>
+    <w:autoRedefine/>
+    <w:uiPriority w:val="39"/>
+    <w:semiHidden/>
+    <w:unhideWhenUsed/>
+    <w:rsid w:val="009675FA"/>
+    <w:pPr>
+      <w:spacing w:after="100"/>
+      <w:ind w:left="1080"/>
+    </w:pPr>
+  </w:style>
+  <w:style w:type="paragraph" w:styleId="TM8">
+    <w:name w:val="toc 8"/>
+    <w:basedOn w:val="Normal"/>
+    <w:next w:val="Normal"/>
+    <w:autoRedefine/>
+    <w:uiPriority w:val="39"/>
+    <w:semiHidden/>
+    <w:unhideWhenUsed/>
+    <w:rsid w:val="009675FA"/>
+    <w:pPr>
+      <w:spacing w:after="100"/>
+      <w:ind w:left="1260"/>
+    </w:pPr>
+  </w:style>
+  <w:style w:type="paragraph" w:styleId="TM9">
+    <w:name w:val="toc 9"/>
+    <w:basedOn w:val="Normal"/>
+    <w:next w:val="Normal"/>
+    <w:autoRedefine/>
+    <w:uiPriority w:val="39"/>
+    <w:semiHidden/>
+    <w:unhideWhenUsed/>
+    <w:rsid w:val="009675FA"/>
+    <w:pPr>
+      <w:spacing w:after="100"/>
+      <w:ind w:left="1440"/>
+    </w:pPr>
+  </w:style>
 </w:styles>
 </file>
 

</xml_diff>

<commit_message>
Update CV (add CNRS)
</commit_message>
<xml_diff>
--- a/doc/CV_Raphael_Scapolan.docx
+++ b/doc/CV_Raphael_Scapolan.docx
@@ -300,13 +300,23 @@
               </w:rPr>
             </w:pPr>
             <w:hyperlink r:id="rId10" w:history="1">
+              <w:proofErr w:type="spellStart"/>
               <w:r>
                 <w:rPr>
                   <w:rStyle w:val="Lienhypertexte"/>
                   <w:b/>
                   <w:lang w:val="fi-FI"/>
                 </w:rPr>
-                <w:t>Mon L</w:t>
+                <w:t>Mon</w:t>
+              </w:r>
+              <w:proofErr w:type="spellEnd"/>
+              <w:r>
+                <w:rPr>
+                  <w:rStyle w:val="Lienhypertexte"/>
+                  <w:b/>
+                  <w:lang w:val="fi-FI"/>
+                </w:rPr>
+                <w:t xml:space="preserve"> L</w:t>
               </w:r>
               <w:r>
                 <w:rPr>
@@ -326,13 +336,23 @@
               </w:rPr>
             </w:pPr>
             <w:hyperlink r:id="rId11" w:history="1">
+              <w:proofErr w:type="spellStart"/>
               <w:r>
                 <w:rPr>
                   <w:rStyle w:val="Lienhypertexte"/>
                   <w:b/>
                   <w:lang w:val="fi-FI"/>
                 </w:rPr>
-                <w:t>Mon P</w:t>
+                <w:t>Mon</w:t>
+              </w:r>
+              <w:proofErr w:type="spellEnd"/>
+              <w:r>
+                <w:rPr>
+                  <w:rStyle w:val="Lienhypertexte"/>
+                  <w:b/>
+                  <w:lang w:val="fi-FI"/>
+                </w:rPr>
+                <w:t xml:space="preserve"> P</w:t>
               </w:r>
               <w:r>
                 <w:rPr>
@@ -381,7 +401,14 @@
               <w:rPr>
                 <w:b/>
               </w:rPr>
-              <w:t>/ WPF</w:t>
+              <w:t xml:space="preserve">/ </w:t>
+            </w:r>
+            <w:proofErr w:type="gramStart"/>
+            <w:r>
+              <w:rPr>
+                <w:b/>
+              </w:rPr>
+              <w:t>WPF</w:t>
             </w:r>
             <w:r>
               <w:rPr>
@@ -390,11 +417,13 @@
               </w:rPr>
               <w:t xml:space="preserve">  expert</w:t>
             </w:r>
+            <w:proofErr w:type="gramEnd"/>
           </w:p>
           <w:p>
             <w:pPr>
               <w:pStyle w:val="Listepuces"/>
             </w:pPr>
+            <w:proofErr w:type="gramStart"/>
             <w:r>
               <w:rPr>
                 <w:b/>
@@ -415,6 +444,7 @@
               </w:rPr>
               <w:t>confirmé</w:t>
             </w:r>
+            <w:proofErr w:type="gramEnd"/>
           </w:p>
           <w:p>
             <w:pPr>
@@ -436,16 +466,34 @@
             <w:pPr>
               <w:pStyle w:val="Listepuces"/>
             </w:pPr>
-            <w:r>
-              <w:t>GitLab CI/CD</w:t>
+            <w:proofErr w:type="spellStart"/>
+            <w:r>
+              <w:t>GitLab</w:t>
+            </w:r>
+            <w:proofErr w:type="spellEnd"/>
+            <w:r>
+              <w:t xml:space="preserve"> CI/CD</w:t>
             </w:r>
           </w:p>
           <w:p>
             <w:pPr>
               <w:pStyle w:val="Listepuces"/>
             </w:pPr>
-            <w:r>
-              <w:t>Specflow / Reqnroll (BDD)</w:t>
+            <w:proofErr w:type="spellStart"/>
+            <w:r>
+              <w:t>Specflow</w:t>
+            </w:r>
+            <w:proofErr w:type="spellEnd"/>
+            <w:r>
+              <w:t xml:space="preserve"> / </w:t>
+            </w:r>
+            <w:proofErr w:type="spellStart"/>
+            <w:r>
+              <w:t>Reqnroll</w:t>
+            </w:r>
+            <w:proofErr w:type="spellEnd"/>
+            <w:r>
+              <w:t xml:space="preserve"> (BDD)</w:t>
             </w:r>
           </w:p>
           <w:p>
@@ -453,8 +501,13 @@
               <w:pStyle w:val="Listepuces"/>
             </w:pPr>
             <w:r>
-              <w:t>Migration d'applications legacy</w:t>
-            </w:r>
+              <w:t xml:space="preserve">Migration d'applications </w:t>
+            </w:r>
+            <w:proofErr w:type="spellStart"/>
+            <w:r>
+              <w:t>legacy</w:t>
+            </w:r>
+            <w:proofErr w:type="spellEnd"/>
           </w:p>
           <w:p>
             <w:pPr>
@@ -494,19 +547,29 @@
               <w:pStyle w:val="Listepuces"/>
             </w:pPr>
             <w:r>
-              <w:t>Extraction et matching de documents</w:t>
+              <w:t xml:space="preserve">Extraction et </w:t>
+            </w:r>
+            <w:proofErr w:type="spellStart"/>
+            <w:r>
+              <w:t>matching</w:t>
+            </w:r>
+            <w:proofErr w:type="spellEnd"/>
+            <w:r>
+              <w:t xml:space="preserve"> de documents</w:t>
             </w:r>
           </w:p>
           <w:p>
             <w:pPr>
               <w:pStyle w:val="Listepuces"/>
             </w:pPr>
+            <w:proofErr w:type="spellStart"/>
             <w:r>
               <w:t>MCP</w:t>
             </w:r>
             <w:r>
               <w:t>s</w:t>
             </w:r>
+            <w:proofErr w:type="spellEnd"/>
           </w:p>
           <w:p>
             <w:pPr>
@@ -1019,14 +1082,30 @@
             <w:pPr>
               <w:pStyle w:val="Listepuces"/>
             </w:pPr>
+            <w:proofErr w:type="spellStart"/>
             <w:r>
               <w:rPr>
                 <w:b/>
               </w:rPr>
-              <w:t xml:space="preserve">Core ERP &amp; e-commerce — </w:t>
-            </w:r>
-            <w:r>
-              <w:t>développement du module d'achats intégré et de l'interconnexion e-commerce par flux cXML.</w:t>
+              <w:t>Core</w:t>
+            </w:r>
+            <w:proofErr w:type="spellEnd"/>
+            <w:r>
+              <w:rPr>
+                <w:b/>
+              </w:rPr>
+              <w:t xml:space="preserve"> ERP &amp; e-commerce — </w:t>
+            </w:r>
+            <w:r>
+              <w:t xml:space="preserve">développement du module d'achats intégré et de l'interconnexion e-commerce par flux </w:t>
+            </w:r>
+            <w:proofErr w:type="spellStart"/>
+            <w:r>
+              <w:t>cXML</w:t>
+            </w:r>
+            <w:proofErr w:type="spellEnd"/>
+            <w:r>
+              <w:t>.</w:t>
             </w:r>
           </w:p>
           <w:p>
@@ -1040,7 +1119,15 @@
               <w:t xml:space="preserve">Architecture — </w:t>
             </w:r>
             <w:r>
-              <w:t xml:space="preserve">client lourd adossé à un serveur, chaîne CI/CD GitLab, outillage interne de pilotage local </w:t>
+              <w:t xml:space="preserve">client lourd adossé à un serveur, chaîne CI/CD </w:t>
+            </w:r>
+            <w:proofErr w:type="spellStart"/>
+            <w:r>
+              <w:t>GitLab</w:t>
+            </w:r>
+            <w:proofErr w:type="spellEnd"/>
+            <w:r>
+              <w:t xml:space="preserve">, outillage interne de pilotage local </w:t>
             </w:r>
             <w:r>
               <w:t xml:space="preserve">de </w:t>
@@ -1066,7 +1153,23 @@
               <w:t xml:space="preserve">Qualité — </w:t>
             </w:r>
             <w:r>
-              <w:t>tests automatisés BDD (Specflow / Reqnroll), indexation des règles métier, revue de code systématique.</w:t>
+              <w:t>tests automatisés BDD (</w:t>
+            </w:r>
+            <w:proofErr w:type="spellStart"/>
+            <w:r>
+              <w:t>Specflow</w:t>
+            </w:r>
+            <w:proofErr w:type="spellEnd"/>
+            <w:r>
+              <w:t xml:space="preserve"> / </w:t>
+            </w:r>
+            <w:proofErr w:type="spellStart"/>
+            <w:r>
+              <w:t>Reqnroll</w:t>
+            </w:r>
+            <w:proofErr w:type="spellEnd"/>
+            <w:r>
+              <w:t>), indexation des règles métier, revue de code systématique.</w:t>
             </w:r>
           </w:p>
           <w:p>
@@ -1080,7 +1183,15 @@
               <w:t xml:space="preserve">Intégration IA — </w:t>
             </w:r>
             <w:r>
-              <w:t>automatisation des demandes d'achat et du traitement des factures, extraction intelligente, matching.</w:t>
+              <w:t xml:space="preserve">automatisation des demandes d'achat et du traitement des factures, extraction intelligente, </w:t>
+            </w:r>
+            <w:proofErr w:type="spellStart"/>
+            <w:r>
+              <w:t>matching</w:t>
+            </w:r>
+            <w:proofErr w:type="spellEnd"/>
+            <w:r>
+              <w:t>.</w:t>
             </w:r>
           </w:p>
           <w:p>
@@ -1094,7 +1205,31 @@
               <w:t xml:space="preserve">IA &amp; outillage technique — </w:t>
             </w:r>
             <w:r>
-              <w:t>développement assisté par IA, revue de code augmentée, écosystème de MCPs (indexation de codebase, GitLab / Redmine), AI Buildathons.</w:t>
+              <w:t xml:space="preserve">développement assisté par IA, revue de code augmentée, écosystème de </w:t>
+            </w:r>
+            <w:proofErr w:type="spellStart"/>
+            <w:r>
+              <w:t>MCPs</w:t>
+            </w:r>
+            <w:proofErr w:type="spellEnd"/>
+            <w:r>
+              <w:t xml:space="preserve"> (indexation de codebase, </w:t>
+            </w:r>
+            <w:proofErr w:type="spellStart"/>
+            <w:r>
+              <w:t>GitLab</w:t>
+            </w:r>
+            <w:proofErr w:type="spellEnd"/>
+            <w:r>
+              <w:t xml:space="preserve"> / Redmine), AI </w:t>
+            </w:r>
+            <w:proofErr w:type="spellStart"/>
+            <w:r>
+              <w:t>Buildathons</w:t>
+            </w:r>
+            <w:proofErr w:type="spellEnd"/>
+            <w:r>
+              <w:t>.</w:t>
             </w:r>
           </w:p>
           <w:p>
@@ -1172,12 +1307,21 @@
               <w:keepNext/>
               <w:spacing w:after="60"/>
             </w:pPr>
+            <w:proofErr w:type="spellStart"/>
             <w:r>
               <w:rPr>
                 <w:b/>
                 <w:sz w:val="19"/>
               </w:rPr>
-              <w:t>Akkodis (ex-Akka Technologies) – mission Schneider Electric, Grenoble</w:t>
+              <w:t>Akkodis</w:t>
+            </w:r>
+            <w:proofErr w:type="spellEnd"/>
+            <w:r>
+              <w:rPr>
+                <w:b/>
+                <w:sz w:val="19"/>
+              </w:rPr>
+              <w:t xml:space="preserve"> (ex-Akka Technologies) – mission Schneider Electric, Grenoble</w:t>
             </w:r>
           </w:p>
           <w:p>
@@ -1258,12 +1402,28 @@
               <w:keepNext/>
               <w:spacing w:after="60"/>
             </w:pPr>
+            <w:proofErr w:type="spellStart"/>
             <w:r>
               <w:rPr>
                 <w:b/>
                 <w:sz w:val="19"/>
               </w:rPr>
-              <w:t>SIMaP, Laboratoire de Recherche sur les Matériaux – Grenoble</w:t>
+              <w:t>SIMaP</w:t>
+            </w:r>
+            <w:proofErr w:type="spellEnd"/>
+            <w:r>
+              <w:rPr>
+                <w:b/>
+                <w:sz w:val="19"/>
+              </w:rPr>
+              <w:t xml:space="preserve"> (CNRS)</w:t>
+            </w:r>
+            <w:r>
+              <w:rPr>
+                <w:b/>
+                <w:sz w:val="19"/>
+              </w:rPr>
+              <w:t>, Laboratoire de Recherche sur les Matériaux – Grenoble</w:t>
             </w:r>
           </w:p>
           <w:p>
@@ -1283,11 +1443,19 @@
             <w:pPr>
               <w:pStyle w:val="Listepuces"/>
             </w:pPr>
+            <w:proofErr w:type="spellStart"/>
             <w:r>
               <w:rPr>
                 <w:b/>
               </w:rPr>
-              <w:t xml:space="preserve">ModeLitz — </w:t>
+              <w:t>ModeLitz</w:t>
+            </w:r>
+            <w:proofErr w:type="spellEnd"/>
+            <w:r>
+              <w:rPr>
+                <w:b/>
+              </w:rPr>
+              <w:t xml:space="preserve"> — </w:t>
             </w:r>
             <w:r>
               <w:t>conception et implémentation d'un solveur HPC parallèle par méthode intégrale, déposé auprès de l'Agence pour la protection des programmes</w:t>
@@ -1358,11 +1526,21 @@
               <w:t xml:space="preserve">Thèse en texte intégral sur HAL : </w:t>
             </w:r>
             <w:hyperlink r:id="rId12" w:history="1">
+              <w:proofErr w:type="spellStart"/>
+              <w:proofErr w:type="gramStart"/>
               <w:r>
                 <w:rPr>
                   <w:rStyle w:val="Lienhypertexte"/>
                 </w:rPr>
-                <w:t>theses.hal.science/tel-01104637v1</w:t>
+                <w:t>theses.hal.science</w:t>
+              </w:r>
+              <w:proofErr w:type="spellEnd"/>
+              <w:proofErr w:type="gramEnd"/>
+              <w:r>
+                <w:rPr>
+                  <w:rStyle w:val="Lienhypertexte"/>
+                </w:rPr>
+                <w:t>/tel-01104637v1</w:t>
               </w:r>
             </w:hyperlink>
             <w:r>
@@ -1374,15 +1552,64 @@
               <w:pStyle w:val="Listepuces"/>
             </w:pPr>
             <w:r>
-              <w:t xml:space="preserve">3-D Multistrands Inductor Modeling: Influence of Complex Geometrical Arrangements — </w:t>
+              <w:t xml:space="preserve">3-D </w:t>
+            </w:r>
+            <w:proofErr w:type="spellStart"/>
+            <w:r>
+              <w:t>Multistrands</w:t>
+            </w:r>
+            <w:proofErr w:type="spellEnd"/>
+            <w:r>
+              <w:t xml:space="preserve"> </w:t>
+            </w:r>
+            <w:proofErr w:type="spellStart"/>
+            <w:r>
+              <w:t>Inductor</w:t>
+            </w:r>
+            <w:proofErr w:type="spellEnd"/>
+            <w:r>
+              <w:t xml:space="preserve"> </w:t>
+            </w:r>
+            <w:proofErr w:type="gramStart"/>
+            <w:r>
+              <w:t>Modeling:</w:t>
+            </w:r>
+            <w:proofErr w:type="gramEnd"/>
+            <w:r>
+              <w:t xml:space="preserve"> Influence of </w:t>
+            </w:r>
+            <w:proofErr w:type="spellStart"/>
+            <w:r>
+              <w:t>Complex</w:t>
+            </w:r>
+            <w:proofErr w:type="spellEnd"/>
+            <w:r>
+              <w:t xml:space="preserve"> </w:t>
+            </w:r>
+            <w:proofErr w:type="spellStart"/>
+            <w:r>
+              <w:t>Geometrical</w:t>
+            </w:r>
+            <w:proofErr w:type="spellEnd"/>
+            <w:r>
+              <w:t xml:space="preserve"> Arrangements — </w:t>
             </w:r>
             <w:r>
               <w:rPr>
                 <w:b/>
                 <w:bCs/>
               </w:rPr>
-              <w:t>IEEE Transactions on Magnetics</w:t>
-            </w:r>
+              <w:t xml:space="preserve">IEEE Transactions on </w:t>
+            </w:r>
+            <w:proofErr w:type="spellStart"/>
+            <w:r>
+              <w:rPr>
+                <w:b/>
+                <w:bCs/>
+              </w:rPr>
+              <w:t>Magnetics</w:t>
+            </w:r>
+            <w:proofErr w:type="spellEnd"/>
             <w:r>
               <w:t>, 50(2), février 2014 (DOI 10.1109/TMAG.2013.2282502).</w:t>
             </w:r>
@@ -1399,7 +1626,21 @@
                 <w:lang w:val="en-US"/>
               </w:rPr>
               <w:lastRenderedPageBreak/>
-              <w:t xml:space="preserve">3D Integral Method for Electromagnetic Processes Modelling — colloque scientifique </w:t>
+              <w:t xml:space="preserve">3D Integral Method for Electromagnetic Processes Modelling — colloque </w:t>
+            </w:r>
+            <w:proofErr w:type="spellStart"/>
+            <w:r>
+              <w:rPr>
+                <w:lang w:val="en-US"/>
+              </w:rPr>
+              <w:t>scientifique</w:t>
+            </w:r>
+            <w:proofErr w:type="spellEnd"/>
+            <w:r>
+              <w:rPr>
+                <w:lang w:val="en-US"/>
+              </w:rPr>
+              <w:t xml:space="preserve"> </w:t>
             </w:r>
             <w:r>
               <w:rPr>
@@ -1421,7 +1662,21 @@
               <w:rPr>
                 <w:lang w:val="en-US"/>
               </w:rPr>
-              <w:t>, septembre 2014.</w:t>
+              <w:t xml:space="preserve">, </w:t>
+            </w:r>
+            <w:proofErr w:type="spellStart"/>
+            <w:r>
+              <w:rPr>
+                <w:lang w:val="en-US"/>
+              </w:rPr>
+              <w:t>septembre</w:t>
+            </w:r>
+            <w:proofErr w:type="spellEnd"/>
+            <w:r>
+              <w:rPr>
+                <w:lang w:val="en-US"/>
+              </w:rPr>
+              <w:t xml:space="preserve"> 2014.</w:t>
             </w:r>
           </w:p>
           <w:p>
@@ -1478,11 +1733,16 @@
             <w:r>
               <w:t xml:space="preserve">interface </w:t>
             </w:r>
+            <w:proofErr w:type="spellStart"/>
             <w:r>
               <w:t>Bla</w:t>
             </w:r>
             <w:r>
-              <w:t xml:space="preserve">zor partagée entre </w:t>
+              <w:t>zor</w:t>
+            </w:r>
+            <w:proofErr w:type="spellEnd"/>
+            <w:r>
+              <w:t xml:space="preserve"> partagée entre </w:t>
             </w:r>
             <w:r>
               <w:t>application mobile et site web</w:t>
@@ -1506,7 +1766,23 @@
               <w:t xml:space="preserve">assuré via CI/CD </w:t>
             </w:r>
             <w:r>
-              <w:t>(.NET 10, MAUI, Blazor Hybrid, PostgreSQL, Docker).</w:t>
+              <w:t xml:space="preserve">(.NET 10, MAUI, </w:t>
+            </w:r>
+            <w:proofErr w:type="spellStart"/>
+            <w:r>
+              <w:t>Blazor</w:t>
+            </w:r>
+            <w:proofErr w:type="spellEnd"/>
+            <w:r>
+              <w:t xml:space="preserve"> </w:t>
+            </w:r>
+            <w:proofErr w:type="spellStart"/>
+            <w:r>
+              <w:t>Hybrid</w:t>
+            </w:r>
+            <w:proofErr w:type="spellEnd"/>
+            <w:r>
+              <w:t>, PostgreSQL, Docker).</w:t>
             </w:r>
           </w:p>
           <w:p>
@@ -1532,7 +1808,23 @@
               <w:t xml:space="preserve"> — </w:t>
             </w:r>
             <w:r>
-              <w:t>physique de vol, génération procédurale déterministe, suite de tests en headless (Godot 4, GDScript).</w:t>
+              <w:t xml:space="preserve">physique de vol, génération procédurale déterministe, suite de tests en </w:t>
+            </w:r>
+            <w:proofErr w:type="spellStart"/>
+            <w:r>
+              <w:t>headless</w:t>
+            </w:r>
+            <w:proofErr w:type="spellEnd"/>
+            <w:r>
+              <w:t xml:space="preserve"> (Godot 4, </w:t>
+            </w:r>
+            <w:proofErr w:type="spellStart"/>
+            <w:r>
+              <w:t>GDScript</w:t>
+            </w:r>
+            <w:proofErr w:type="spellEnd"/>
+            <w:r>
+              <w:t>).</w:t>
             </w:r>
           </w:p>
         </w:tc>

</xml_diff>